<commit_message>
Add game design research guides
</commit_message>
<xml_diff>
--- a/Long form/The-Art-of-Monetization-Audit-Workflow-Checklist.docx
+++ b/Long form/The-Art-of-Monetization-Audit-Workflow-Checklist.docx
@@ -27,7 +27,7 @@
           <w:color w:val="475569"/>
           <w:sz w:val="26"/>
         </w:rPr>
-        <w:t>Master Audit Workflow &amp; Operational Checklist Companion</w:t>
+        <w:t>Operational Monetization Audit &amp; QA Checklist</w:t>
       </w:r>
     </w:p>
     <w:p>
@@ -42,8 +42,1521 @@
           <w:color w:val="334155"/>
           <w:sz w:val="19"/>
         </w:rPr>
-        <w:t>How to Use: Keep this companion open next to your live game build and analytics dashboard. Trace the 6-stage lifecycle, execute diagnostic reality checks, and ensure all 10 Definition of Done quality gates are met before scaling UA spend.</w:t>
+        <w:t>Use this document beside the live build, source-of-truth dashboard, and store configuration. For every failed check, capture evidence, classify severity, assign one owner and a due date, then retest before closing it. Do not authorize UA scale on a critical trust, consent, purchase, or reward-delivery failure.</w:t>
       </w:r>
+    </w:p>
+    <w:p>
+      <w:pPr>
+        <w:keepNext/>
+        <w:spacing w:before="280" w:after="80"/>
+      </w:pPr>
+      <w:r>
+        <w:rPr>
+          <w:rFonts w:ascii="Calibri" w:hAnsi="Calibri"/>
+          <w:b/>
+          <w:color w:val="0F172A"/>
+          <w:sz w:val="30"/>
+        </w:rPr>
+        <w:t>Audit Control Sheet</w:t>
+      </w:r>
+    </w:p>
+    <w:p>
+      <w:pPr>
+        <w:spacing w:after="60"/>
+        <w:jc w:val="both"/>
+      </w:pPr>
+      <w:r>
+        <w:rPr>
+          <w:color w:val="334155"/>
+          <w:sz w:val="19"/>
+        </w:rPr>
+        <w:t>Scope: [Prototype / Soft Launch / Live Game]     Project: [________________]     Build: [________]     Date: [________]     Audit Lead: [________________]</w:t>
+      </w:r>
+    </w:p>
+    <w:p>
+      <w:pPr>
+        <w:spacing w:after="60"/>
+        <w:jc w:val="both"/>
+      </w:pPr>
+      <w:r>
+        <w:rPr>
+          <w:color w:val="334155"/>
+          <w:sz w:val="19"/>
+        </w:rPr>
+        <w:t>Evidence standard: a check is PASS only when the auditor has directly verified the player path and, where available, linked supporting cohort telemetry. Use N/A only when the game stage genuinely makes the check inapplicable; write the reason.</w:t>
+      </w:r>
+    </w:p>
+    <w:tbl>
+      <w:tblPr>
+        <w:tblW w:type="auto" w:w="0"/>
+        <w:jc w:val="center"/>
+        <w:tblLook w:firstColumn="1" w:firstRow="1" w:lastColumn="0" w:lastRow="0" w:noHBand="0" w:noVBand="1" w:val="04A0"/>
+        <w:tblBorders>
+          <w:top w:val="single" w:sz="4" w:space="0" w:color="CBD5E1"/>
+          <w:bottom w:val="single" w:sz="4" w:space="0" w:color="CBD5E1"/>
+          <w:left w:val="single" w:sz="4" w:space="0" w:color="CBD5E1"/>
+          <w:right w:val="single" w:sz="4" w:space="0" w:color="CBD5E1"/>
+          <w:insideH w:val="single" w:sz="4" w:space="0" w:color="CBD5E1"/>
+          <w:insideV w:val="single" w:sz="4" w:space="0" w:color="CBD5E1"/>
+        </w:tblBorders>
+      </w:tblPr>
+      <w:tblGrid>
+        <w:gridCol w:w="3369"/>
+        <w:gridCol w:w="3369"/>
+        <w:gridCol w:w="3369"/>
+      </w:tblGrid>
+      <w:tr>
+        <w:trPr>
+          <w:tblHeader/>
+        </w:trPr>
+        <w:tc>
+          <w:tcPr>
+            <w:tcW w:type="dxa" w:w="3369"/>
+            <w:shd w:fill="0F172A"/>
+            <w:tcMar>
+              <w:top w:w="100" w:type="dxa"/>
+              <w:bottom w:w="100" w:type="dxa"/>
+              <w:left w:w="100" w:type="dxa"/>
+              <w:right w:w="100" w:type="dxa"/>
+            </w:tcMar>
+          </w:tcPr>
+          <w:p>
+            <w:pPr>
+              <w:spacing w:after="0"/>
+            </w:pPr>
+            <w:r>
+              <w:rPr>
+                <w:rFonts w:ascii="Calibri" w:hAnsi="Calibri"/>
+                <w:b/>
+                <w:color w:val="FFFFFF"/>
+                <w:sz w:val="17"/>
+              </w:rPr>
+              <w:t>Status</w:t>
+            </w:r>
+          </w:p>
+        </w:tc>
+        <w:tc>
+          <w:tcPr>
+            <w:tcW w:type="dxa" w:w="3369"/>
+            <w:shd w:fill="0F172A"/>
+            <w:tcMar>
+              <w:top w:w="100" w:type="dxa"/>
+              <w:bottom w:w="100" w:type="dxa"/>
+              <w:left w:w="100" w:type="dxa"/>
+              <w:right w:w="100" w:type="dxa"/>
+            </w:tcMar>
+          </w:tcPr>
+          <w:p>
+            <w:pPr>
+              <w:spacing w:after="0"/>
+            </w:pPr>
+            <w:r>
+              <w:rPr>
+                <w:rFonts w:ascii="Calibri" w:hAnsi="Calibri"/>
+                <w:b/>
+                <w:color w:val="FFFFFF"/>
+                <w:sz w:val="17"/>
+              </w:rPr>
+              <w:t>Meaning</w:t>
+            </w:r>
+          </w:p>
+        </w:tc>
+        <w:tc>
+          <w:tcPr>
+            <w:tcW w:type="dxa" w:w="3369"/>
+            <w:shd w:fill="0F172A"/>
+            <w:tcMar>
+              <w:top w:w="100" w:type="dxa"/>
+              <w:bottom w:w="100" w:type="dxa"/>
+              <w:left w:w="100" w:type="dxa"/>
+              <w:right w:w="100" w:type="dxa"/>
+            </w:tcMar>
+          </w:tcPr>
+          <w:p>
+            <w:pPr>
+              <w:spacing w:after="0"/>
+            </w:pPr>
+            <w:r>
+              <w:rPr>
+                <w:rFonts w:ascii="Calibri" w:hAnsi="Calibri"/>
+                <w:b/>
+                <w:color w:val="FFFFFF"/>
+                <w:sz w:val="17"/>
+              </w:rPr>
+              <w:t>Required action</w:t>
+            </w:r>
+          </w:p>
+        </w:tc>
+      </w:tr>
+      <w:tr>
+        <w:tc>
+          <w:tcPr>
+            <w:tcW w:type="dxa" w:w="3369"/>
+            <w:shd w:fill="FFFFFF"/>
+            <w:tcMar>
+              <w:top w:w="80" w:type="dxa"/>
+              <w:bottom w:w="80" w:type="dxa"/>
+              <w:left w:w="90" w:type="dxa"/>
+              <w:right w:w="90" w:type="dxa"/>
+            </w:tcMar>
+          </w:tcPr>
+          <w:p>
+            <w:pPr>
+              <w:spacing w:after="0"/>
+            </w:pPr>
+            <w:r>
+              <w:rPr>
+                <w:rFonts w:ascii="Calibri" w:hAnsi="Calibri"/>
+                <w:b/>
+                <w:color w:val="0F172A"/>
+                <w:sz w:val="17"/>
+              </w:rPr>
+              <w:t>PASS</w:t>
+            </w:r>
+          </w:p>
+        </w:tc>
+        <w:tc>
+          <w:tcPr>
+            <w:tcW w:type="dxa" w:w="3369"/>
+            <w:shd w:fill="FFFFFF"/>
+            <w:tcMar>
+              <w:top w:w="80" w:type="dxa"/>
+              <w:bottom w:w="80" w:type="dxa"/>
+              <w:left w:w="90" w:type="dxa"/>
+              <w:right w:w="90" w:type="dxa"/>
+            </w:tcMar>
+          </w:tcPr>
+          <w:p>
+            <w:pPr>
+              <w:spacing w:after="0"/>
+            </w:pPr>
+            <w:r>
+              <w:rPr>
+                <w:rFonts w:ascii="Calibri" w:hAnsi="Calibri"/>
+                <w:color w:val="334155"/>
+                <w:sz w:val="17"/>
+              </w:rPr>
+              <w:t>Observed behavior meets the stated requirement; evidence is recorded.</w:t>
+            </w:r>
+          </w:p>
+        </w:tc>
+        <w:tc>
+          <w:tcPr>
+            <w:tcW w:type="dxa" w:w="3369"/>
+            <w:shd w:fill="FFFFFF"/>
+            <w:tcMar>
+              <w:top w:w="80" w:type="dxa"/>
+              <w:bottom w:w="80" w:type="dxa"/>
+              <w:left w:w="90" w:type="dxa"/>
+              <w:right w:w="90" w:type="dxa"/>
+            </w:tcMar>
+          </w:tcPr>
+          <w:p>
+            <w:pPr>
+              <w:spacing w:after="0"/>
+            </w:pPr>
+            <w:r>
+              <w:rPr>
+                <w:rFonts w:ascii="Calibri" w:hAnsi="Calibri"/>
+                <w:color w:val="334155"/>
+                <w:sz w:val="17"/>
+              </w:rPr>
+              <w:t>Keep evidence link, screenshot, or query reference.</w:t>
+            </w:r>
+          </w:p>
+        </w:tc>
+      </w:tr>
+      <w:tr>
+        <w:tc>
+          <w:tcPr>
+            <w:tcW w:type="dxa" w:w="3369"/>
+            <w:shd w:fill="F8FAFC"/>
+            <w:tcMar>
+              <w:top w:w="80" w:type="dxa"/>
+              <w:bottom w:w="80" w:type="dxa"/>
+              <w:left w:w="90" w:type="dxa"/>
+              <w:right w:w="90" w:type="dxa"/>
+            </w:tcMar>
+          </w:tcPr>
+          <w:p>
+            <w:pPr>
+              <w:spacing w:after="0"/>
+            </w:pPr>
+            <w:r>
+              <w:rPr>
+                <w:rFonts w:ascii="Calibri" w:hAnsi="Calibri"/>
+                <w:b/>
+                <w:color w:val="0F172A"/>
+                <w:sz w:val="17"/>
+              </w:rPr>
+              <w:t>FAIL – Critical</w:t>
+            </w:r>
+          </w:p>
+        </w:tc>
+        <w:tc>
+          <w:tcPr>
+            <w:tcW w:type="dxa" w:w="3369"/>
+            <w:shd w:fill="F8FAFC"/>
+            <w:tcMar>
+              <w:top w:w="80" w:type="dxa"/>
+              <w:bottom w:w="80" w:type="dxa"/>
+              <w:left w:w="90" w:type="dxa"/>
+              <w:right w:w="90" w:type="dxa"/>
+            </w:tcMar>
+          </w:tcPr>
+          <w:p>
+            <w:pPr>
+              <w:spacing w:after="0"/>
+            </w:pPr>
+            <w:r>
+              <w:rPr>
+                <w:rFonts w:ascii="Calibri" w:hAnsi="Calibri"/>
+                <w:color w:val="334155"/>
+                <w:sz w:val="17"/>
+              </w:rPr>
+              <w:t>Trust, consent, purchase, reward delivery, or legal/platform risk.</w:t>
+            </w:r>
+          </w:p>
+        </w:tc>
+        <w:tc>
+          <w:tcPr>
+            <w:tcW w:type="dxa" w:w="3369"/>
+            <w:shd w:fill="F8FAFC"/>
+            <w:tcMar>
+              <w:top w:w="80" w:type="dxa"/>
+              <w:bottom w:w="80" w:type="dxa"/>
+              <w:left w:w="90" w:type="dxa"/>
+              <w:right w:w="90" w:type="dxa"/>
+            </w:tcMar>
+          </w:tcPr>
+          <w:p>
+            <w:pPr>
+              <w:spacing w:after="0"/>
+            </w:pPr>
+            <w:r>
+              <w:rPr>
+                <w:rFonts w:ascii="Calibri" w:hAnsi="Calibri"/>
+                <w:color w:val="334155"/>
+                <w:sz w:val="17"/>
+              </w:rPr>
+              <w:t>Block release or UA scale; owner and rollback plan required.</w:t>
+            </w:r>
+          </w:p>
+        </w:tc>
+      </w:tr>
+      <w:tr>
+        <w:tc>
+          <w:tcPr>
+            <w:tcW w:type="dxa" w:w="3369"/>
+            <w:shd w:fill="FFFFFF"/>
+            <w:tcMar>
+              <w:top w:w="80" w:type="dxa"/>
+              <w:bottom w:w="80" w:type="dxa"/>
+              <w:left w:w="90" w:type="dxa"/>
+              <w:right w:w="90" w:type="dxa"/>
+            </w:tcMar>
+          </w:tcPr>
+          <w:p>
+            <w:pPr>
+              <w:spacing w:after="0"/>
+            </w:pPr>
+            <w:r>
+              <w:rPr>
+                <w:rFonts w:ascii="Calibri" w:hAnsi="Calibri"/>
+                <w:b/>
+                <w:color w:val="0F172A"/>
+                <w:sz w:val="17"/>
+              </w:rPr>
+              <w:t>FAIL – High</w:t>
+            </w:r>
+          </w:p>
+        </w:tc>
+        <w:tc>
+          <w:tcPr>
+            <w:tcW w:type="dxa" w:w="3369"/>
+            <w:shd w:fill="FFFFFF"/>
+            <w:tcMar>
+              <w:top w:w="80" w:type="dxa"/>
+              <w:bottom w:w="80" w:type="dxa"/>
+              <w:left w:w="90" w:type="dxa"/>
+              <w:right w:w="90" w:type="dxa"/>
+            </w:tcMar>
+          </w:tcPr>
+          <w:p>
+            <w:pPr>
+              <w:spacing w:after="0"/>
+            </w:pPr>
+            <w:r>
+              <w:rPr>
+                <w:rFonts w:ascii="Calibri" w:hAnsi="Calibri"/>
+                <w:color w:val="334155"/>
+                <w:sz w:val="17"/>
+              </w:rPr>
+              <w:t>Material retention, fairness, economy, or monetization harm.</w:t>
+            </w:r>
+          </w:p>
+        </w:tc>
+        <w:tc>
+          <w:tcPr>
+            <w:tcW w:type="dxa" w:w="3369"/>
+            <w:shd w:fill="FFFFFF"/>
+            <w:tcMar>
+              <w:top w:w="80" w:type="dxa"/>
+              <w:bottom w:w="80" w:type="dxa"/>
+              <w:left w:w="90" w:type="dxa"/>
+              <w:right w:w="90" w:type="dxa"/>
+            </w:tcMar>
+          </w:tcPr>
+          <w:p>
+            <w:pPr>
+              <w:spacing w:after="0"/>
+            </w:pPr>
+            <w:r>
+              <w:rPr>
+                <w:rFonts w:ascii="Calibri" w:hAnsi="Calibri"/>
+                <w:color w:val="334155"/>
+                <w:sz w:val="17"/>
+              </w:rPr>
+              <w:t>Fix before the next scale decision; retest required.</w:t>
+            </w:r>
+          </w:p>
+        </w:tc>
+      </w:tr>
+      <w:tr>
+        <w:tc>
+          <w:tcPr>
+            <w:tcW w:type="dxa" w:w="3369"/>
+            <w:shd w:fill="F8FAFC"/>
+            <w:tcMar>
+              <w:top w:w="80" w:type="dxa"/>
+              <w:bottom w:w="80" w:type="dxa"/>
+              <w:left w:w="90" w:type="dxa"/>
+              <w:right w:w="90" w:type="dxa"/>
+            </w:tcMar>
+          </w:tcPr>
+          <w:p>
+            <w:pPr>
+              <w:spacing w:after="0"/>
+            </w:pPr>
+            <w:r>
+              <w:rPr>
+                <w:rFonts w:ascii="Calibri" w:hAnsi="Calibri"/>
+                <w:b/>
+                <w:color w:val="0F172A"/>
+                <w:sz w:val="17"/>
+              </w:rPr>
+              <w:t>FAIL – Medium / Low</w:t>
+            </w:r>
+          </w:p>
+        </w:tc>
+        <w:tc>
+          <w:tcPr>
+            <w:tcW w:type="dxa" w:w="3369"/>
+            <w:shd w:fill="F8FAFC"/>
+            <w:tcMar>
+              <w:top w:w="80" w:type="dxa"/>
+              <w:bottom w:w="80" w:type="dxa"/>
+              <w:left w:w="90" w:type="dxa"/>
+              <w:right w:w="90" w:type="dxa"/>
+            </w:tcMar>
+          </w:tcPr>
+          <w:p>
+            <w:pPr>
+              <w:spacing w:after="0"/>
+            </w:pPr>
+            <w:r>
+              <w:rPr>
+                <w:rFonts w:ascii="Calibri" w:hAnsi="Calibri"/>
+                <w:color w:val="334155"/>
+                <w:sz w:val="17"/>
+              </w:rPr>
+              <w:t>Important optimization or presentation issue without immediate player harm.</w:t>
+            </w:r>
+          </w:p>
+        </w:tc>
+        <w:tc>
+          <w:tcPr>
+            <w:tcW w:type="dxa" w:w="3369"/>
+            <w:shd w:fill="F8FAFC"/>
+            <w:tcMar>
+              <w:top w:w="80" w:type="dxa"/>
+              <w:bottom w:w="80" w:type="dxa"/>
+              <w:left w:w="90" w:type="dxa"/>
+              <w:right w:w="90" w:type="dxa"/>
+            </w:tcMar>
+          </w:tcPr>
+          <w:p>
+            <w:pPr>
+              <w:spacing w:after="0"/>
+            </w:pPr>
+            <w:r>
+              <w:rPr>
+                <w:rFonts w:ascii="Calibri" w:hAnsi="Calibri"/>
+                <w:color w:val="334155"/>
+                <w:sz w:val="17"/>
+              </w:rPr>
+              <w:t>Create a prioritized experiment or backlog item.</w:t>
+            </w:r>
+          </w:p>
+        </w:tc>
+      </w:tr>
+      <w:tr>
+        <w:tc>
+          <w:tcPr>
+            <w:tcW w:type="dxa" w:w="3369"/>
+            <w:shd w:fill="FFFFFF"/>
+            <w:tcMar>
+              <w:top w:w="80" w:type="dxa"/>
+              <w:bottom w:w="80" w:type="dxa"/>
+              <w:left w:w="90" w:type="dxa"/>
+              <w:right w:w="90" w:type="dxa"/>
+            </w:tcMar>
+          </w:tcPr>
+          <w:p>
+            <w:pPr>
+              <w:spacing w:after="0"/>
+            </w:pPr>
+            <w:r>
+              <w:rPr>
+                <w:rFonts w:ascii="Calibri" w:hAnsi="Calibri"/>
+                <w:b/>
+                <w:color w:val="0F172A"/>
+                <w:sz w:val="17"/>
+              </w:rPr>
+              <w:t>N/A</w:t>
+            </w:r>
+          </w:p>
+        </w:tc>
+        <w:tc>
+          <w:tcPr>
+            <w:tcW w:type="dxa" w:w="3369"/>
+            <w:shd w:fill="FFFFFF"/>
+            <w:tcMar>
+              <w:top w:w="80" w:type="dxa"/>
+              <w:bottom w:w="80" w:type="dxa"/>
+              <w:left w:w="90" w:type="dxa"/>
+              <w:right w:w="90" w:type="dxa"/>
+            </w:tcMar>
+          </w:tcPr>
+          <w:p>
+            <w:pPr>
+              <w:spacing w:after="0"/>
+            </w:pPr>
+            <w:r>
+              <w:rPr>
+                <w:rFonts w:ascii="Calibri" w:hAnsi="Calibri"/>
+                <w:color w:val="334155"/>
+                <w:sz w:val="17"/>
+              </w:rPr>
+              <w:t>Not applicable at this product stage.</w:t>
+            </w:r>
+          </w:p>
+        </w:tc>
+        <w:tc>
+          <w:tcPr>
+            <w:tcW w:type="dxa" w:w="3369"/>
+            <w:shd w:fill="FFFFFF"/>
+            <w:tcMar>
+              <w:top w:w="80" w:type="dxa"/>
+              <w:bottom w:w="80" w:type="dxa"/>
+              <w:left w:w="90" w:type="dxa"/>
+              <w:right w:w="90" w:type="dxa"/>
+            </w:tcMar>
+          </w:tcPr>
+          <w:p>
+            <w:pPr>
+              <w:spacing w:after="0"/>
+            </w:pPr>
+            <w:r>
+              <w:rPr>
+                <w:rFonts w:ascii="Calibri" w:hAnsi="Calibri"/>
+                <w:color w:val="334155"/>
+                <w:sz w:val="17"/>
+              </w:rPr>
+              <w:t>State why; review at the next stage gate.</w:t>
+            </w:r>
+          </w:p>
+        </w:tc>
+      </w:tr>
+    </w:tbl>
+    <w:p>
+      <w:pPr>
+        <w:spacing w:after="80"/>
+      </w:pPr>
+    </w:p>
+    <w:p>
+      <w:pPr>
+        <w:keepNext/>
+        <w:spacing w:before="240" w:after="80"/>
+      </w:pPr>
+      <w:r>
+        <w:rPr>
+          <w:rFonts w:ascii="Calibri" w:hAnsi="Calibri"/>
+          <w:b/>
+          <w:color w:val="1E3A8A"/>
+          <w:sz w:val="24"/>
+        </w:rPr>
+        <w:t>Finding Log (complete one row for every FAIL)</w:t>
+      </w:r>
+    </w:p>
+    <w:tbl>
+      <w:tblPr>
+        <w:tblW w:type="auto" w:w="0"/>
+        <w:jc w:val="center"/>
+        <w:tblLook w:firstColumn="1" w:firstRow="1" w:lastColumn="0" w:lastRow="0" w:noHBand="0" w:noVBand="1" w:val="04A0"/>
+        <w:tblBorders>
+          <w:top w:val="single" w:sz="4" w:space="0" w:color="CBD5E1"/>
+          <w:bottom w:val="single" w:sz="4" w:space="0" w:color="CBD5E1"/>
+          <w:left w:val="single" w:sz="4" w:space="0" w:color="CBD5E1"/>
+          <w:right w:val="single" w:sz="4" w:space="0" w:color="CBD5E1"/>
+          <w:insideH w:val="single" w:sz="4" w:space="0" w:color="CBD5E1"/>
+          <w:insideV w:val="single" w:sz="4" w:space="0" w:color="CBD5E1"/>
+        </w:tblBorders>
+      </w:tblPr>
+      <w:tblGrid>
+        <w:gridCol w:w="1684"/>
+        <w:gridCol w:w="1684"/>
+        <w:gridCol w:w="1684"/>
+        <w:gridCol w:w="1684"/>
+        <w:gridCol w:w="1684"/>
+        <w:gridCol w:w="1684"/>
+      </w:tblGrid>
+      <w:tr>
+        <w:trPr>
+          <w:tblHeader/>
+        </w:trPr>
+        <w:tc>
+          <w:tcPr>
+            <w:tcW w:type="dxa" w:w="1684"/>
+            <w:shd w:fill="0F172A"/>
+            <w:tcMar>
+              <w:top w:w="100" w:type="dxa"/>
+              <w:bottom w:w="100" w:type="dxa"/>
+              <w:left w:w="100" w:type="dxa"/>
+              <w:right w:w="100" w:type="dxa"/>
+            </w:tcMar>
+          </w:tcPr>
+          <w:p>
+            <w:pPr>
+              <w:spacing w:after="0"/>
+            </w:pPr>
+            <w:r>
+              <w:rPr>
+                <w:rFonts w:ascii="Calibri" w:hAnsi="Calibri"/>
+                <w:b/>
+                <w:color w:val="FFFFFF"/>
+                <w:sz w:val="17"/>
+              </w:rPr>
+              <w:t>Check ID</w:t>
+            </w:r>
+          </w:p>
+        </w:tc>
+        <w:tc>
+          <w:tcPr>
+            <w:tcW w:type="dxa" w:w="1684"/>
+            <w:shd w:fill="0F172A"/>
+            <w:tcMar>
+              <w:top w:w="100" w:type="dxa"/>
+              <w:bottom w:w="100" w:type="dxa"/>
+              <w:left w:w="100" w:type="dxa"/>
+              <w:right w:w="100" w:type="dxa"/>
+            </w:tcMar>
+          </w:tcPr>
+          <w:p>
+            <w:pPr>
+              <w:spacing w:after="0"/>
+            </w:pPr>
+            <w:r>
+              <w:rPr>
+                <w:rFonts w:ascii="Calibri" w:hAnsi="Calibri"/>
+                <w:b/>
+                <w:color w:val="FFFFFF"/>
+                <w:sz w:val="17"/>
+              </w:rPr>
+              <w:t>Status / Severity</w:t>
+            </w:r>
+          </w:p>
+        </w:tc>
+        <w:tc>
+          <w:tcPr>
+            <w:tcW w:type="dxa" w:w="1684"/>
+            <w:shd w:fill="0F172A"/>
+            <w:tcMar>
+              <w:top w:w="100" w:type="dxa"/>
+              <w:bottom w:w="100" w:type="dxa"/>
+              <w:left w:w="100" w:type="dxa"/>
+              <w:right w:w="100" w:type="dxa"/>
+            </w:tcMar>
+          </w:tcPr>
+          <w:p>
+            <w:pPr>
+              <w:spacing w:after="0"/>
+            </w:pPr>
+            <w:r>
+              <w:rPr>
+                <w:rFonts w:ascii="Calibri" w:hAnsi="Calibri"/>
+                <w:b/>
+                <w:color w:val="FFFFFF"/>
+                <w:sz w:val="17"/>
+              </w:rPr>
+              <w:t>Evidence</w:t>
+            </w:r>
+          </w:p>
+        </w:tc>
+        <w:tc>
+          <w:tcPr>
+            <w:tcW w:type="dxa" w:w="1684"/>
+            <w:shd w:fill="0F172A"/>
+            <w:tcMar>
+              <w:top w:w="100" w:type="dxa"/>
+              <w:bottom w:w="100" w:type="dxa"/>
+              <w:left w:w="100" w:type="dxa"/>
+              <w:right w:w="100" w:type="dxa"/>
+            </w:tcMar>
+          </w:tcPr>
+          <w:p>
+            <w:pPr>
+              <w:spacing w:after="0"/>
+            </w:pPr>
+            <w:r>
+              <w:rPr>
+                <w:rFonts w:ascii="Calibri" w:hAnsi="Calibri"/>
+                <w:b/>
+                <w:color w:val="FFFFFF"/>
+                <w:sz w:val="17"/>
+              </w:rPr>
+              <w:t>Owner</w:t>
+            </w:r>
+          </w:p>
+        </w:tc>
+        <w:tc>
+          <w:tcPr>
+            <w:tcW w:type="dxa" w:w="1684"/>
+            <w:shd w:fill="0F172A"/>
+            <w:tcMar>
+              <w:top w:w="100" w:type="dxa"/>
+              <w:bottom w:w="100" w:type="dxa"/>
+              <w:left w:w="100" w:type="dxa"/>
+              <w:right w:w="100" w:type="dxa"/>
+            </w:tcMar>
+          </w:tcPr>
+          <w:p>
+            <w:pPr>
+              <w:spacing w:after="0"/>
+            </w:pPr>
+            <w:r>
+              <w:rPr>
+                <w:rFonts w:ascii="Calibri" w:hAnsi="Calibri"/>
+                <w:b/>
+                <w:color w:val="FFFFFF"/>
+                <w:sz w:val="17"/>
+              </w:rPr>
+              <w:t>Due date</w:t>
+            </w:r>
+          </w:p>
+        </w:tc>
+        <w:tc>
+          <w:tcPr>
+            <w:tcW w:type="dxa" w:w="1684"/>
+            <w:shd w:fill="0F172A"/>
+            <w:tcMar>
+              <w:top w:w="100" w:type="dxa"/>
+              <w:bottom w:w="100" w:type="dxa"/>
+              <w:left w:w="100" w:type="dxa"/>
+              <w:right w:w="100" w:type="dxa"/>
+            </w:tcMar>
+          </w:tcPr>
+          <w:p>
+            <w:pPr>
+              <w:spacing w:after="0"/>
+            </w:pPr>
+            <w:r>
+              <w:rPr>
+                <w:rFonts w:ascii="Calibri" w:hAnsi="Calibri"/>
+                <w:b/>
+                <w:color w:val="FFFFFF"/>
+                <w:sz w:val="17"/>
+              </w:rPr>
+              <w:t>Retest / Decision</w:t>
+            </w:r>
+          </w:p>
+        </w:tc>
+      </w:tr>
+      <w:tr>
+        <w:tc>
+          <w:tcPr>
+            <w:tcW w:type="dxa" w:w="1684"/>
+            <w:shd w:fill="FFFFFF"/>
+            <w:tcMar>
+              <w:top w:w="80" w:type="dxa"/>
+              <w:bottom w:w="80" w:type="dxa"/>
+              <w:left w:w="90" w:type="dxa"/>
+              <w:right w:w="90" w:type="dxa"/>
+            </w:tcMar>
+          </w:tcPr>
+          <w:p>
+            <w:pPr>
+              <w:spacing w:after="0"/>
+            </w:pPr>
+            <w:r>
+              <w:rPr>
+                <w:rFonts w:ascii="Calibri" w:hAnsi="Calibri"/>
+                <w:b/>
+                <w:color w:val="0F172A"/>
+                <w:sz w:val="17"/>
+              </w:rPr>
+              <w:t>[e.g., 3.2]</w:t>
+            </w:r>
+          </w:p>
+        </w:tc>
+        <w:tc>
+          <w:tcPr>
+            <w:tcW w:type="dxa" w:w="1684"/>
+            <w:shd w:fill="FFFFFF"/>
+            <w:tcMar>
+              <w:top w:w="80" w:type="dxa"/>
+              <w:bottom w:w="80" w:type="dxa"/>
+              <w:left w:w="90" w:type="dxa"/>
+              <w:right w:w="90" w:type="dxa"/>
+            </w:tcMar>
+          </w:tcPr>
+          <w:p>
+            <w:pPr>
+              <w:spacing w:after="0"/>
+            </w:pPr>
+            <w:r>
+              <w:rPr>
+                <w:rFonts w:ascii="Calibri" w:hAnsi="Calibri"/>
+                <w:color w:val="334155"/>
+                <w:sz w:val="17"/>
+              </w:rPr>
+              <w:t>[FAIL – High]</w:t>
+            </w:r>
+          </w:p>
+        </w:tc>
+        <w:tc>
+          <w:tcPr>
+            <w:tcW w:type="dxa" w:w="1684"/>
+            <w:shd w:fill="FFFFFF"/>
+            <w:tcMar>
+              <w:top w:w="80" w:type="dxa"/>
+              <w:bottom w:w="80" w:type="dxa"/>
+              <w:left w:w="90" w:type="dxa"/>
+              <w:right w:w="90" w:type="dxa"/>
+            </w:tcMar>
+          </w:tcPr>
+          <w:p>
+            <w:pPr>
+              <w:spacing w:after="0"/>
+            </w:pPr>
+            <w:r>
+              <w:rPr>
+                <w:rFonts w:ascii="Calibri" w:hAnsi="Calibri"/>
+                <w:color w:val="334155"/>
+                <w:sz w:val="17"/>
+              </w:rPr>
+              <w:t>[screen, video, dashboard link, cohort/date]</w:t>
+            </w:r>
+          </w:p>
+        </w:tc>
+        <w:tc>
+          <w:tcPr>
+            <w:tcW w:type="dxa" w:w="1684"/>
+            <w:shd w:fill="FFFFFF"/>
+            <w:tcMar>
+              <w:top w:w="80" w:type="dxa"/>
+              <w:bottom w:w="80" w:type="dxa"/>
+              <w:left w:w="90" w:type="dxa"/>
+              <w:right w:w="90" w:type="dxa"/>
+            </w:tcMar>
+          </w:tcPr>
+          <w:p>
+            <w:pPr>
+              <w:spacing w:after="0"/>
+            </w:pPr>
+            <w:r>
+              <w:rPr>
+                <w:rFonts w:ascii="Calibri" w:hAnsi="Calibri"/>
+                <w:color w:val="334155"/>
+                <w:sz w:val="17"/>
+              </w:rPr>
+              <w:t>[DRI]</w:t>
+            </w:r>
+          </w:p>
+        </w:tc>
+        <w:tc>
+          <w:tcPr>
+            <w:tcW w:type="dxa" w:w="1684"/>
+            <w:shd w:fill="FFFFFF"/>
+            <w:tcMar>
+              <w:top w:w="80" w:type="dxa"/>
+              <w:bottom w:w="80" w:type="dxa"/>
+              <w:left w:w="90" w:type="dxa"/>
+              <w:right w:w="90" w:type="dxa"/>
+            </w:tcMar>
+          </w:tcPr>
+          <w:p>
+            <w:pPr>
+              <w:spacing w:after="0"/>
+            </w:pPr>
+            <w:r>
+              <w:rPr>
+                <w:rFonts w:ascii="Calibri" w:hAnsi="Calibri"/>
+                <w:b/>
+                <w:color w:val="1E3A8A"/>
+                <w:sz w:val="17"/>
+              </w:rPr>
+              <w:t>[YYYY-MM-DD]</w:t>
+            </w:r>
+          </w:p>
+        </w:tc>
+        <w:tc>
+          <w:tcPr>
+            <w:tcW w:type="dxa" w:w="1684"/>
+            <w:shd w:fill="FFFFFF"/>
+            <w:tcMar>
+              <w:top w:w="80" w:type="dxa"/>
+              <w:bottom w:w="80" w:type="dxa"/>
+              <w:left w:w="90" w:type="dxa"/>
+              <w:right w:w="90" w:type="dxa"/>
+            </w:tcMar>
+          </w:tcPr>
+          <w:p>
+            <w:pPr>
+              <w:spacing w:after="0"/>
+            </w:pPr>
+            <w:r>
+              <w:rPr>
+                <w:rFonts w:ascii="Calibri" w:hAnsi="Calibri"/>
+                <w:color w:val="334155"/>
+                <w:sz w:val="17"/>
+              </w:rPr>
+              <w:t>[Open / Pass / Rollback]</w:t>
+            </w:r>
+          </w:p>
+        </w:tc>
+      </w:tr>
+      <w:tr>
+        <w:tc>
+          <w:tcPr>
+            <w:tcW w:type="dxa" w:w="1684"/>
+            <w:shd w:fill="F8FAFC"/>
+            <w:tcMar>
+              <w:top w:w="80" w:type="dxa"/>
+              <w:bottom w:w="80" w:type="dxa"/>
+              <w:left w:w="90" w:type="dxa"/>
+              <w:right w:w="90" w:type="dxa"/>
+            </w:tcMar>
+          </w:tcPr>
+          <w:p>
+            <w:pPr>
+              <w:spacing w:after="0"/>
+            </w:pPr>
+            <w:r>
+              <w:rPr>
+                <w:rFonts w:ascii="Calibri" w:hAnsi="Calibri"/>
+                <w:b/>
+                <w:color w:val="0F172A"/>
+                <w:sz w:val="17"/>
+              </w:rPr>
+              <w:t>[e.g., 3.2]</w:t>
+            </w:r>
+          </w:p>
+        </w:tc>
+        <w:tc>
+          <w:tcPr>
+            <w:tcW w:type="dxa" w:w="1684"/>
+            <w:shd w:fill="F8FAFC"/>
+            <w:tcMar>
+              <w:top w:w="80" w:type="dxa"/>
+              <w:bottom w:w="80" w:type="dxa"/>
+              <w:left w:w="90" w:type="dxa"/>
+              <w:right w:w="90" w:type="dxa"/>
+            </w:tcMar>
+          </w:tcPr>
+          <w:p>
+            <w:pPr>
+              <w:spacing w:after="0"/>
+            </w:pPr>
+            <w:r>
+              <w:rPr>
+                <w:rFonts w:ascii="Calibri" w:hAnsi="Calibri"/>
+                <w:color w:val="334155"/>
+                <w:sz w:val="17"/>
+              </w:rPr>
+              <w:t>[FAIL – High]</w:t>
+            </w:r>
+          </w:p>
+        </w:tc>
+        <w:tc>
+          <w:tcPr>
+            <w:tcW w:type="dxa" w:w="1684"/>
+            <w:shd w:fill="F8FAFC"/>
+            <w:tcMar>
+              <w:top w:w="80" w:type="dxa"/>
+              <w:bottom w:w="80" w:type="dxa"/>
+              <w:left w:w="90" w:type="dxa"/>
+              <w:right w:w="90" w:type="dxa"/>
+            </w:tcMar>
+          </w:tcPr>
+          <w:p>
+            <w:pPr>
+              <w:spacing w:after="0"/>
+            </w:pPr>
+            <w:r>
+              <w:rPr>
+                <w:rFonts w:ascii="Calibri" w:hAnsi="Calibri"/>
+                <w:color w:val="334155"/>
+                <w:sz w:val="17"/>
+              </w:rPr>
+              <w:t>[screen, video, dashboard link, cohort/date]</w:t>
+            </w:r>
+          </w:p>
+        </w:tc>
+        <w:tc>
+          <w:tcPr>
+            <w:tcW w:type="dxa" w:w="1684"/>
+            <w:shd w:fill="F8FAFC"/>
+            <w:tcMar>
+              <w:top w:w="80" w:type="dxa"/>
+              <w:bottom w:w="80" w:type="dxa"/>
+              <w:left w:w="90" w:type="dxa"/>
+              <w:right w:w="90" w:type="dxa"/>
+            </w:tcMar>
+          </w:tcPr>
+          <w:p>
+            <w:pPr>
+              <w:spacing w:after="0"/>
+            </w:pPr>
+            <w:r>
+              <w:rPr>
+                <w:rFonts w:ascii="Calibri" w:hAnsi="Calibri"/>
+                <w:color w:val="334155"/>
+                <w:sz w:val="17"/>
+              </w:rPr>
+              <w:t>[DRI]</w:t>
+            </w:r>
+          </w:p>
+        </w:tc>
+        <w:tc>
+          <w:tcPr>
+            <w:tcW w:type="dxa" w:w="1684"/>
+            <w:shd w:fill="F8FAFC"/>
+            <w:tcMar>
+              <w:top w:w="80" w:type="dxa"/>
+              <w:bottom w:w="80" w:type="dxa"/>
+              <w:left w:w="90" w:type="dxa"/>
+              <w:right w:w="90" w:type="dxa"/>
+            </w:tcMar>
+          </w:tcPr>
+          <w:p>
+            <w:pPr>
+              <w:spacing w:after="0"/>
+            </w:pPr>
+            <w:r>
+              <w:rPr>
+                <w:rFonts w:ascii="Calibri" w:hAnsi="Calibri"/>
+                <w:b/>
+                <w:color w:val="1E3A8A"/>
+                <w:sz w:val="17"/>
+              </w:rPr>
+              <w:t>[YYYY-MM-DD]</w:t>
+            </w:r>
+          </w:p>
+        </w:tc>
+        <w:tc>
+          <w:tcPr>
+            <w:tcW w:type="dxa" w:w="1684"/>
+            <w:shd w:fill="F8FAFC"/>
+            <w:tcMar>
+              <w:top w:w="80" w:type="dxa"/>
+              <w:bottom w:w="80" w:type="dxa"/>
+              <w:left w:w="90" w:type="dxa"/>
+              <w:right w:w="90" w:type="dxa"/>
+            </w:tcMar>
+          </w:tcPr>
+          <w:p>
+            <w:pPr>
+              <w:spacing w:after="0"/>
+            </w:pPr>
+            <w:r>
+              <w:rPr>
+                <w:rFonts w:ascii="Calibri" w:hAnsi="Calibri"/>
+                <w:color w:val="334155"/>
+                <w:sz w:val="17"/>
+              </w:rPr>
+              <w:t>[Open / Pass / Rollback]</w:t>
+            </w:r>
+          </w:p>
+        </w:tc>
+      </w:tr>
+      <w:tr>
+        <w:tc>
+          <w:tcPr>
+            <w:tcW w:type="dxa" w:w="1684"/>
+            <w:shd w:fill="FFFFFF"/>
+            <w:tcMar>
+              <w:top w:w="80" w:type="dxa"/>
+              <w:bottom w:w="80" w:type="dxa"/>
+              <w:left w:w="90" w:type="dxa"/>
+              <w:right w:w="90" w:type="dxa"/>
+            </w:tcMar>
+          </w:tcPr>
+          <w:p>
+            <w:pPr>
+              <w:spacing w:after="0"/>
+            </w:pPr>
+            <w:r>
+              <w:rPr>
+                <w:rFonts w:ascii="Calibri" w:hAnsi="Calibri"/>
+                <w:b/>
+                <w:color w:val="0F172A"/>
+                <w:sz w:val="17"/>
+              </w:rPr>
+              <w:t>[e.g., 3.2]</w:t>
+            </w:r>
+          </w:p>
+        </w:tc>
+        <w:tc>
+          <w:tcPr>
+            <w:tcW w:type="dxa" w:w="1684"/>
+            <w:shd w:fill="FFFFFF"/>
+            <w:tcMar>
+              <w:top w:w="80" w:type="dxa"/>
+              <w:bottom w:w="80" w:type="dxa"/>
+              <w:left w:w="90" w:type="dxa"/>
+              <w:right w:w="90" w:type="dxa"/>
+            </w:tcMar>
+          </w:tcPr>
+          <w:p>
+            <w:pPr>
+              <w:spacing w:after="0"/>
+            </w:pPr>
+            <w:r>
+              <w:rPr>
+                <w:rFonts w:ascii="Calibri" w:hAnsi="Calibri"/>
+                <w:color w:val="334155"/>
+                <w:sz w:val="17"/>
+              </w:rPr>
+              <w:t>[FAIL – High]</w:t>
+            </w:r>
+          </w:p>
+        </w:tc>
+        <w:tc>
+          <w:tcPr>
+            <w:tcW w:type="dxa" w:w="1684"/>
+            <w:shd w:fill="FFFFFF"/>
+            <w:tcMar>
+              <w:top w:w="80" w:type="dxa"/>
+              <w:bottom w:w="80" w:type="dxa"/>
+              <w:left w:w="90" w:type="dxa"/>
+              <w:right w:w="90" w:type="dxa"/>
+            </w:tcMar>
+          </w:tcPr>
+          <w:p>
+            <w:pPr>
+              <w:spacing w:after="0"/>
+            </w:pPr>
+            <w:r>
+              <w:rPr>
+                <w:rFonts w:ascii="Calibri" w:hAnsi="Calibri"/>
+                <w:color w:val="334155"/>
+                <w:sz w:val="17"/>
+              </w:rPr>
+              <w:t>[screen, video, dashboard link, cohort/date]</w:t>
+            </w:r>
+          </w:p>
+        </w:tc>
+        <w:tc>
+          <w:tcPr>
+            <w:tcW w:type="dxa" w:w="1684"/>
+            <w:shd w:fill="FFFFFF"/>
+            <w:tcMar>
+              <w:top w:w="80" w:type="dxa"/>
+              <w:bottom w:w="80" w:type="dxa"/>
+              <w:left w:w="90" w:type="dxa"/>
+              <w:right w:w="90" w:type="dxa"/>
+            </w:tcMar>
+          </w:tcPr>
+          <w:p>
+            <w:pPr>
+              <w:spacing w:after="0"/>
+            </w:pPr>
+            <w:r>
+              <w:rPr>
+                <w:rFonts w:ascii="Calibri" w:hAnsi="Calibri"/>
+                <w:color w:val="334155"/>
+                <w:sz w:val="17"/>
+              </w:rPr>
+              <w:t>[DRI]</w:t>
+            </w:r>
+          </w:p>
+        </w:tc>
+        <w:tc>
+          <w:tcPr>
+            <w:tcW w:type="dxa" w:w="1684"/>
+            <w:shd w:fill="FFFFFF"/>
+            <w:tcMar>
+              <w:top w:w="80" w:type="dxa"/>
+              <w:bottom w:w="80" w:type="dxa"/>
+              <w:left w:w="90" w:type="dxa"/>
+              <w:right w:w="90" w:type="dxa"/>
+            </w:tcMar>
+          </w:tcPr>
+          <w:p>
+            <w:pPr>
+              <w:spacing w:after="0"/>
+            </w:pPr>
+            <w:r>
+              <w:rPr>
+                <w:rFonts w:ascii="Calibri" w:hAnsi="Calibri"/>
+                <w:b/>
+                <w:color w:val="1E3A8A"/>
+                <w:sz w:val="17"/>
+              </w:rPr>
+              <w:t>[YYYY-MM-DD]</w:t>
+            </w:r>
+          </w:p>
+        </w:tc>
+        <w:tc>
+          <w:tcPr>
+            <w:tcW w:type="dxa" w:w="1684"/>
+            <w:shd w:fill="FFFFFF"/>
+            <w:tcMar>
+              <w:top w:w="80" w:type="dxa"/>
+              <w:bottom w:w="80" w:type="dxa"/>
+              <w:left w:w="90" w:type="dxa"/>
+              <w:right w:w="90" w:type="dxa"/>
+            </w:tcMar>
+          </w:tcPr>
+          <w:p>
+            <w:pPr>
+              <w:spacing w:after="0"/>
+            </w:pPr>
+            <w:r>
+              <w:rPr>
+                <w:rFonts w:ascii="Calibri" w:hAnsi="Calibri"/>
+                <w:color w:val="334155"/>
+                <w:sz w:val="17"/>
+              </w:rPr>
+              <w:t>[Open / Pass / Rollback]</w:t>
+            </w:r>
+          </w:p>
+        </w:tc>
+      </w:tr>
+      <w:tr>
+        <w:tc>
+          <w:tcPr>
+            <w:tcW w:type="dxa" w:w="1684"/>
+            <w:shd w:fill="F8FAFC"/>
+            <w:tcMar>
+              <w:top w:w="80" w:type="dxa"/>
+              <w:bottom w:w="80" w:type="dxa"/>
+              <w:left w:w="90" w:type="dxa"/>
+              <w:right w:w="90" w:type="dxa"/>
+            </w:tcMar>
+          </w:tcPr>
+          <w:p>
+            <w:pPr>
+              <w:spacing w:after="0"/>
+            </w:pPr>
+            <w:r>
+              <w:rPr>
+                <w:rFonts w:ascii="Calibri" w:hAnsi="Calibri"/>
+                <w:b/>
+                <w:color w:val="0F172A"/>
+                <w:sz w:val="17"/>
+              </w:rPr>
+              <w:t>[e.g., 3.2]</w:t>
+            </w:r>
+          </w:p>
+        </w:tc>
+        <w:tc>
+          <w:tcPr>
+            <w:tcW w:type="dxa" w:w="1684"/>
+            <w:shd w:fill="F8FAFC"/>
+            <w:tcMar>
+              <w:top w:w="80" w:type="dxa"/>
+              <w:bottom w:w="80" w:type="dxa"/>
+              <w:left w:w="90" w:type="dxa"/>
+              <w:right w:w="90" w:type="dxa"/>
+            </w:tcMar>
+          </w:tcPr>
+          <w:p>
+            <w:pPr>
+              <w:spacing w:after="0"/>
+            </w:pPr>
+            <w:r>
+              <w:rPr>
+                <w:rFonts w:ascii="Calibri" w:hAnsi="Calibri"/>
+                <w:color w:val="334155"/>
+                <w:sz w:val="17"/>
+              </w:rPr>
+              <w:t>[FAIL – High]</w:t>
+            </w:r>
+          </w:p>
+        </w:tc>
+        <w:tc>
+          <w:tcPr>
+            <w:tcW w:type="dxa" w:w="1684"/>
+            <w:shd w:fill="F8FAFC"/>
+            <w:tcMar>
+              <w:top w:w="80" w:type="dxa"/>
+              <w:bottom w:w="80" w:type="dxa"/>
+              <w:left w:w="90" w:type="dxa"/>
+              <w:right w:w="90" w:type="dxa"/>
+            </w:tcMar>
+          </w:tcPr>
+          <w:p>
+            <w:pPr>
+              <w:spacing w:after="0"/>
+            </w:pPr>
+            <w:r>
+              <w:rPr>
+                <w:rFonts w:ascii="Calibri" w:hAnsi="Calibri"/>
+                <w:color w:val="334155"/>
+                <w:sz w:val="17"/>
+              </w:rPr>
+              <w:t>[screen, video, dashboard link, cohort/date]</w:t>
+            </w:r>
+          </w:p>
+        </w:tc>
+        <w:tc>
+          <w:tcPr>
+            <w:tcW w:type="dxa" w:w="1684"/>
+            <w:shd w:fill="F8FAFC"/>
+            <w:tcMar>
+              <w:top w:w="80" w:type="dxa"/>
+              <w:bottom w:w="80" w:type="dxa"/>
+              <w:left w:w="90" w:type="dxa"/>
+              <w:right w:w="90" w:type="dxa"/>
+            </w:tcMar>
+          </w:tcPr>
+          <w:p>
+            <w:pPr>
+              <w:spacing w:after="0"/>
+            </w:pPr>
+            <w:r>
+              <w:rPr>
+                <w:rFonts w:ascii="Calibri" w:hAnsi="Calibri"/>
+                <w:color w:val="334155"/>
+                <w:sz w:val="17"/>
+              </w:rPr>
+              <w:t>[DRI]</w:t>
+            </w:r>
+          </w:p>
+        </w:tc>
+        <w:tc>
+          <w:tcPr>
+            <w:tcW w:type="dxa" w:w="1684"/>
+            <w:shd w:fill="F8FAFC"/>
+            <w:tcMar>
+              <w:top w:w="80" w:type="dxa"/>
+              <w:bottom w:w="80" w:type="dxa"/>
+              <w:left w:w="90" w:type="dxa"/>
+              <w:right w:w="90" w:type="dxa"/>
+            </w:tcMar>
+          </w:tcPr>
+          <w:p>
+            <w:pPr>
+              <w:spacing w:after="0"/>
+            </w:pPr>
+            <w:r>
+              <w:rPr>
+                <w:rFonts w:ascii="Calibri" w:hAnsi="Calibri"/>
+                <w:b/>
+                <w:color w:val="1E3A8A"/>
+                <w:sz w:val="17"/>
+              </w:rPr>
+              <w:t>[YYYY-MM-DD]</w:t>
+            </w:r>
+          </w:p>
+        </w:tc>
+        <w:tc>
+          <w:tcPr>
+            <w:tcW w:type="dxa" w:w="1684"/>
+            <w:shd w:fill="F8FAFC"/>
+            <w:tcMar>
+              <w:top w:w="80" w:type="dxa"/>
+              <w:bottom w:w="80" w:type="dxa"/>
+              <w:left w:w="90" w:type="dxa"/>
+              <w:right w:w="90" w:type="dxa"/>
+            </w:tcMar>
+          </w:tcPr>
+          <w:p>
+            <w:pPr>
+              <w:spacing w:after="0"/>
+            </w:pPr>
+            <w:r>
+              <w:rPr>
+                <w:rFonts w:ascii="Calibri" w:hAnsi="Calibri"/>
+                <w:color w:val="334155"/>
+                <w:sz w:val="17"/>
+              </w:rPr>
+              <w:t>[Open / Pass / Rollback]</w:t>
+            </w:r>
+          </w:p>
+        </w:tc>
+      </w:tr>
+      <w:tr>
+        <w:tc>
+          <w:tcPr>
+            <w:tcW w:type="dxa" w:w="1684"/>
+            <w:shd w:fill="FFFFFF"/>
+            <w:tcMar>
+              <w:top w:w="80" w:type="dxa"/>
+              <w:bottom w:w="80" w:type="dxa"/>
+              <w:left w:w="90" w:type="dxa"/>
+              <w:right w:w="90" w:type="dxa"/>
+            </w:tcMar>
+          </w:tcPr>
+          <w:p>
+            <w:pPr>
+              <w:spacing w:after="0"/>
+            </w:pPr>
+            <w:r>
+              <w:rPr>
+                <w:rFonts w:ascii="Calibri" w:hAnsi="Calibri"/>
+                <w:b/>
+                <w:color w:val="0F172A"/>
+                <w:sz w:val="17"/>
+              </w:rPr>
+              <w:t>[e.g., 3.2]</w:t>
+            </w:r>
+          </w:p>
+        </w:tc>
+        <w:tc>
+          <w:tcPr>
+            <w:tcW w:type="dxa" w:w="1684"/>
+            <w:shd w:fill="FFFFFF"/>
+            <w:tcMar>
+              <w:top w:w="80" w:type="dxa"/>
+              <w:bottom w:w="80" w:type="dxa"/>
+              <w:left w:w="90" w:type="dxa"/>
+              <w:right w:w="90" w:type="dxa"/>
+            </w:tcMar>
+          </w:tcPr>
+          <w:p>
+            <w:pPr>
+              <w:spacing w:after="0"/>
+            </w:pPr>
+            <w:r>
+              <w:rPr>
+                <w:rFonts w:ascii="Calibri" w:hAnsi="Calibri"/>
+                <w:color w:val="334155"/>
+                <w:sz w:val="17"/>
+              </w:rPr>
+              <w:t>[FAIL – High]</w:t>
+            </w:r>
+          </w:p>
+        </w:tc>
+        <w:tc>
+          <w:tcPr>
+            <w:tcW w:type="dxa" w:w="1684"/>
+            <w:shd w:fill="FFFFFF"/>
+            <w:tcMar>
+              <w:top w:w="80" w:type="dxa"/>
+              <w:bottom w:w="80" w:type="dxa"/>
+              <w:left w:w="90" w:type="dxa"/>
+              <w:right w:w="90" w:type="dxa"/>
+            </w:tcMar>
+          </w:tcPr>
+          <w:p>
+            <w:pPr>
+              <w:spacing w:after="0"/>
+            </w:pPr>
+            <w:r>
+              <w:rPr>
+                <w:rFonts w:ascii="Calibri" w:hAnsi="Calibri"/>
+                <w:color w:val="334155"/>
+                <w:sz w:val="17"/>
+              </w:rPr>
+              <w:t>[screen, video, dashboard link, cohort/date]</w:t>
+            </w:r>
+          </w:p>
+        </w:tc>
+        <w:tc>
+          <w:tcPr>
+            <w:tcW w:type="dxa" w:w="1684"/>
+            <w:shd w:fill="FFFFFF"/>
+            <w:tcMar>
+              <w:top w:w="80" w:type="dxa"/>
+              <w:bottom w:w="80" w:type="dxa"/>
+              <w:left w:w="90" w:type="dxa"/>
+              <w:right w:w="90" w:type="dxa"/>
+            </w:tcMar>
+          </w:tcPr>
+          <w:p>
+            <w:pPr>
+              <w:spacing w:after="0"/>
+            </w:pPr>
+            <w:r>
+              <w:rPr>
+                <w:rFonts w:ascii="Calibri" w:hAnsi="Calibri"/>
+                <w:color w:val="334155"/>
+                <w:sz w:val="17"/>
+              </w:rPr>
+              <w:t>[DRI]</w:t>
+            </w:r>
+          </w:p>
+        </w:tc>
+        <w:tc>
+          <w:tcPr>
+            <w:tcW w:type="dxa" w:w="1684"/>
+            <w:shd w:fill="FFFFFF"/>
+            <w:tcMar>
+              <w:top w:w="80" w:type="dxa"/>
+              <w:bottom w:w="80" w:type="dxa"/>
+              <w:left w:w="90" w:type="dxa"/>
+              <w:right w:w="90" w:type="dxa"/>
+            </w:tcMar>
+          </w:tcPr>
+          <w:p>
+            <w:pPr>
+              <w:spacing w:after="0"/>
+            </w:pPr>
+            <w:r>
+              <w:rPr>
+                <w:rFonts w:ascii="Calibri" w:hAnsi="Calibri"/>
+                <w:b/>
+                <w:color w:val="1E3A8A"/>
+                <w:sz w:val="17"/>
+              </w:rPr>
+              <w:t>[YYYY-MM-DD]</w:t>
+            </w:r>
+          </w:p>
+        </w:tc>
+        <w:tc>
+          <w:tcPr>
+            <w:tcW w:type="dxa" w:w="1684"/>
+            <w:shd w:fill="FFFFFF"/>
+            <w:tcMar>
+              <w:top w:w="80" w:type="dxa"/>
+              <w:bottom w:w="80" w:type="dxa"/>
+              <w:left w:w="90" w:type="dxa"/>
+              <w:right w:w="90" w:type="dxa"/>
+            </w:tcMar>
+          </w:tcPr>
+          <w:p>
+            <w:pPr>
+              <w:spacing w:after="0"/>
+            </w:pPr>
+            <w:r>
+              <w:rPr>
+                <w:rFonts w:ascii="Calibri" w:hAnsi="Calibri"/>
+                <w:color w:val="334155"/>
+                <w:sz w:val="17"/>
+              </w:rPr>
+              <w:t>[Open / Pass / Rollback]</w:t>
+            </w:r>
+          </w:p>
+        </w:tc>
+      </w:tr>
+    </w:tbl>
+    <w:p>
+      <w:pPr>
+        <w:spacing w:after="80"/>
+      </w:pPr>
     </w:p>
     <w:p>
       <w:pPr>
@@ -3454,7 +4967,7 @@
           <w:color w:val="0F172A"/>
           <w:sz w:val="30"/>
         </w:rPr>
-        <w:t>Stage 6: The 10-Point 'Definition of Done' Scale Scorecard</w:t>
+        <w:t>Stage 5B: Monetization Technical QA</w:t>
       </w:r>
     </w:p>
     <w:p>
@@ -3469,7 +4982,7 @@
           <w:color w:val="334155"/>
           <w:sz w:val="19"/>
         </w:rPr>
-        <w:t>Pass Requirement: Minimum score of 9/10 with ZERO critical trust fails before authorizing UA scale.</w:t>
+        <w:t>Run these checks on every release candidate that changes ads, purchase flow, pricing, entitlements, remote config, or consent. A successful UI review does not replace a verified transaction and reward-delivery test.</w:t>
       </w:r>
     </w:p>
     <w:tbl>
@@ -3487,9 +5000,11 @@
         </w:tblBorders>
       </w:tblPr>
       <w:tblGrid>
-        <w:gridCol w:w="3369"/>
-        <w:gridCol w:w="3369"/>
-        <w:gridCol w:w="3369"/>
+        <w:gridCol w:w="2021"/>
+        <w:gridCol w:w="2021"/>
+        <w:gridCol w:w="2021"/>
+        <w:gridCol w:w="2021"/>
+        <w:gridCol w:w="2021"/>
       </w:tblGrid>
       <w:tr>
         <w:trPr>
@@ -3497,7 +5012,973 @@
         </w:trPr>
         <w:tc>
           <w:tcPr>
-            <w:tcW w:type="dxa" w:w="3369"/>
+            <w:tcW w:type="dxa" w:w="2021"/>
+            <w:shd w:fill="0F172A"/>
+            <w:tcMar>
+              <w:top w:w="100" w:type="dxa"/>
+              <w:bottom w:w="100" w:type="dxa"/>
+              <w:left w:w="100" w:type="dxa"/>
+              <w:right w:w="100" w:type="dxa"/>
+            </w:tcMar>
+          </w:tcPr>
+          <w:p>
+            <w:pPr>
+              <w:spacing w:after="0"/>
+            </w:pPr>
+            <w:r>
+              <w:rPr>
+                <w:rFonts w:ascii="Calibri" w:hAnsi="Calibri"/>
+                <w:b/>
+                <w:color w:val="FFFFFF"/>
+                <w:sz w:val="17"/>
+              </w:rPr>
+              <w:t>QA Check</w:t>
+            </w:r>
+          </w:p>
+        </w:tc>
+        <w:tc>
+          <w:tcPr>
+            <w:tcW w:type="dxa" w:w="2021"/>
+            <w:shd w:fill="0F172A"/>
+            <w:tcMar>
+              <w:top w:w="100" w:type="dxa"/>
+              <w:bottom w:w="100" w:type="dxa"/>
+              <w:left w:w="100" w:type="dxa"/>
+              <w:right w:w="100" w:type="dxa"/>
+            </w:tcMar>
+          </w:tcPr>
+          <w:p>
+            <w:pPr>
+              <w:spacing w:after="0"/>
+            </w:pPr>
+            <w:r>
+              <w:rPr>
+                <w:rFonts w:ascii="Calibri" w:hAnsi="Calibri"/>
+                <w:b/>
+                <w:color w:val="FFFFFF"/>
+                <w:sz w:val="17"/>
+              </w:rPr>
+              <w:t>Pass condition</w:t>
+            </w:r>
+          </w:p>
+        </w:tc>
+        <w:tc>
+          <w:tcPr>
+            <w:tcW w:type="dxa" w:w="2021"/>
+            <w:shd w:fill="0F172A"/>
+            <w:tcMar>
+              <w:top w:w="100" w:type="dxa"/>
+              <w:bottom w:w="100" w:type="dxa"/>
+              <w:left w:w="100" w:type="dxa"/>
+              <w:right w:w="100" w:type="dxa"/>
+            </w:tcMar>
+          </w:tcPr>
+          <w:p>
+            <w:pPr>
+              <w:spacing w:after="0"/>
+            </w:pPr>
+            <w:r>
+              <w:rPr>
+                <w:rFonts w:ascii="Calibri" w:hAnsi="Calibri"/>
+                <w:b/>
+                <w:color w:val="FFFFFF"/>
+                <w:sz w:val="17"/>
+              </w:rPr>
+              <w:t>Failure severity</w:t>
+            </w:r>
+          </w:p>
+        </w:tc>
+        <w:tc>
+          <w:tcPr>
+            <w:tcW w:type="dxa" w:w="2021"/>
+            <w:shd w:fill="0F172A"/>
+            <w:tcMar>
+              <w:top w:w="100" w:type="dxa"/>
+              <w:bottom w:w="100" w:type="dxa"/>
+              <w:left w:w="100" w:type="dxa"/>
+              <w:right w:w="100" w:type="dxa"/>
+            </w:tcMar>
+          </w:tcPr>
+          <w:p>
+            <w:pPr>
+              <w:spacing w:after="0"/>
+            </w:pPr>
+            <w:r>
+              <w:rPr>
+                <w:rFonts w:ascii="Calibri" w:hAnsi="Calibri"/>
+                <w:b/>
+                <w:color w:val="FFFFFF"/>
+                <w:sz w:val="17"/>
+              </w:rPr>
+              <w:t>Evidence to record</w:t>
+            </w:r>
+          </w:p>
+        </w:tc>
+        <w:tc>
+          <w:tcPr>
+            <w:tcW w:type="dxa" w:w="2021"/>
+            <w:shd w:fill="0F172A"/>
+            <w:tcMar>
+              <w:top w:w="100" w:type="dxa"/>
+              <w:bottom w:w="100" w:type="dxa"/>
+              <w:left w:w="100" w:type="dxa"/>
+              <w:right w:w="100" w:type="dxa"/>
+            </w:tcMar>
+          </w:tcPr>
+          <w:p>
+            <w:pPr>
+              <w:spacing w:after="0"/>
+            </w:pPr>
+            <w:r>
+              <w:rPr>
+                <w:rFonts w:ascii="Calibri" w:hAnsi="Calibri"/>
+                <w:b/>
+                <w:color w:val="FFFFFF"/>
+                <w:sz w:val="17"/>
+              </w:rPr>
+              <w:t>Owner</w:t>
+            </w:r>
+          </w:p>
+        </w:tc>
+      </w:tr>
+      <w:tr>
+        <w:tc>
+          <w:tcPr>
+            <w:tcW w:type="dxa" w:w="2021"/>
+            <w:shd w:fill="FFFFFF"/>
+            <w:tcMar>
+              <w:top w:w="80" w:type="dxa"/>
+              <w:bottom w:w="80" w:type="dxa"/>
+              <w:left w:w="90" w:type="dxa"/>
+              <w:right w:w="90" w:type="dxa"/>
+            </w:tcMar>
+          </w:tcPr>
+          <w:p>
+            <w:pPr>
+              <w:spacing w:after="0"/>
+            </w:pPr>
+            <w:r>
+              <w:rPr>
+                <w:rFonts w:ascii="Calibri" w:hAnsi="Calibri"/>
+                <w:b/>
+                <w:color w:val="0F172A"/>
+                <w:sz w:val="17"/>
+              </w:rPr>
+              <w:t>[ ] T1 Rewarded-ad delivery</w:t>
+            </w:r>
+          </w:p>
+        </w:tc>
+        <w:tc>
+          <w:tcPr>
+            <w:tcW w:type="dxa" w:w="2021"/>
+            <w:shd w:fill="FFFFFF"/>
+            <w:tcMar>
+              <w:top w:w="80" w:type="dxa"/>
+              <w:bottom w:w="80" w:type="dxa"/>
+              <w:left w:w="90" w:type="dxa"/>
+              <w:right w:w="90" w:type="dxa"/>
+            </w:tcMar>
+          </w:tcPr>
+          <w:p>
+            <w:pPr>
+              <w:spacing w:after="0"/>
+            </w:pPr>
+            <w:r>
+              <w:rPr>
+                <w:rFonts w:ascii="Calibri" w:hAnsi="Calibri"/>
+                <w:color w:val="334155"/>
+                <w:sz w:val="17"/>
+              </w:rPr>
+              <w:t>Opt-in is voluntary; completion grants exactly one correct reward, immediately; cancellation, timeout, and network failure do not consume value.</w:t>
+            </w:r>
+          </w:p>
+        </w:tc>
+        <w:tc>
+          <w:tcPr>
+            <w:tcW w:type="dxa" w:w="2021"/>
+            <w:shd w:fill="FFFFFF"/>
+            <w:tcMar>
+              <w:top w:w="80" w:type="dxa"/>
+              <w:bottom w:w="80" w:type="dxa"/>
+              <w:left w:w="90" w:type="dxa"/>
+              <w:right w:w="90" w:type="dxa"/>
+            </w:tcMar>
+          </w:tcPr>
+          <w:p>
+            <w:pPr>
+              <w:spacing w:after="0"/>
+            </w:pPr>
+            <w:r>
+              <w:rPr>
+                <w:rFonts w:ascii="Calibri" w:hAnsi="Calibri"/>
+                <w:color w:val="334155"/>
+                <w:sz w:val="17"/>
+              </w:rPr>
+              <w:t>Critical if reward is lost or duplicated</w:t>
+            </w:r>
+          </w:p>
+        </w:tc>
+        <w:tc>
+          <w:tcPr>
+            <w:tcW w:type="dxa" w:w="2021"/>
+            <w:shd w:fill="FFFFFF"/>
+            <w:tcMar>
+              <w:top w:w="80" w:type="dxa"/>
+              <w:bottom w:w="80" w:type="dxa"/>
+              <w:left w:w="90" w:type="dxa"/>
+              <w:right w:w="90" w:type="dxa"/>
+            </w:tcMar>
+          </w:tcPr>
+          <w:p>
+            <w:pPr>
+              <w:spacing w:after="0"/>
+            </w:pPr>
+            <w:r>
+              <w:rPr>
+                <w:rFonts w:ascii="Calibri" w:hAnsi="Calibri"/>
+                <w:color w:val="334155"/>
+                <w:sz w:val="17"/>
+              </w:rPr>
+              <w:t>Device/video; ad callback; reward ledger</w:t>
+            </w:r>
+          </w:p>
+        </w:tc>
+        <w:tc>
+          <w:tcPr>
+            <w:tcW w:type="dxa" w:w="2021"/>
+            <w:shd w:fill="FFFFFF"/>
+            <w:tcMar>
+              <w:top w:w="80" w:type="dxa"/>
+              <w:bottom w:w="80" w:type="dxa"/>
+              <w:left w:w="90" w:type="dxa"/>
+              <w:right w:w="90" w:type="dxa"/>
+            </w:tcMar>
+          </w:tcPr>
+          <w:p>
+            <w:pPr>
+              <w:spacing w:after="0"/>
+            </w:pPr>
+            <w:r>
+              <w:rPr>
+                <w:rFonts w:ascii="Calibri" w:hAnsi="Calibri"/>
+                <w:b/>
+                <w:color w:val="1E3A8A"/>
+                <w:sz w:val="17"/>
+              </w:rPr>
+              <w:t>Ads Eng / QA</w:t>
+            </w:r>
+          </w:p>
+        </w:tc>
+      </w:tr>
+      <w:tr>
+        <w:tc>
+          <w:tcPr>
+            <w:tcW w:type="dxa" w:w="2021"/>
+            <w:shd w:fill="F8FAFC"/>
+            <w:tcMar>
+              <w:top w:w="80" w:type="dxa"/>
+              <w:bottom w:w="80" w:type="dxa"/>
+              <w:left w:w="90" w:type="dxa"/>
+              <w:right w:w="90" w:type="dxa"/>
+            </w:tcMar>
+          </w:tcPr>
+          <w:p>
+            <w:pPr>
+              <w:spacing w:after="0"/>
+            </w:pPr>
+            <w:r>
+              <w:rPr>
+                <w:rFonts w:ascii="Calibri" w:hAnsi="Calibri"/>
+                <w:b/>
+                <w:color w:val="0F172A"/>
+                <w:sz w:val="17"/>
+              </w:rPr>
+              <w:t>[ ] T2 IAP purchase, restore &amp; receipt</w:t>
+            </w:r>
+          </w:p>
+        </w:tc>
+        <w:tc>
+          <w:tcPr>
+            <w:tcW w:type="dxa" w:w="2021"/>
+            <w:shd w:fill="F8FAFC"/>
+            <w:tcMar>
+              <w:top w:w="80" w:type="dxa"/>
+              <w:bottom w:w="80" w:type="dxa"/>
+              <w:left w:w="90" w:type="dxa"/>
+              <w:right w:w="90" w:type="dxa"/>
+            </w:tcMar>
+          </w:tcPr>
+          <w:p>
+            <w:pPr>
+              <w:spacing w:after="0"/>
+            </w:pPr>
+            <w:r>
+              <w:rPr>
+                <w:rFonts w:ascii="Calibri" w:hAnsi="Calibri"/>
+                <w:color w:val="334155"/>
+                <w:sz w:val="17"/>
+              </w:rPr>
+              <w:t>Purchase, cancellation, pending payment, restore, and reinstall preserve correct entitlements with no duplicate charge or missing item.</w:t>
+            </w:r>
+          </w:p>
+        </w:tc>
+        <w:tc>
+          <w:tcPr>
+            <w:tcW w:type="dxa" w:w="2021"/>
+            <w:shd w:fill="F8FAFC"/>
+            <w:tcMar>
+              <w:top w:w="80" w:type="dxa"/>
+              <w:bottom w:w="80" w:type="dxa"/>
+              <w:left w:w="90" w:type="dxa"/>
+              <w:right w:w="90" w:type="dxa"/>
+            </w:tcMar>
+          </w:tcPr>
+          <w:p>
+            <w:pPr>
+              <w:spacing w:after="0"/>
+            </w:pPr>
+            <w:r>
+              <w:rPr>
+                <w:rFonts w:ascii="Calibri" w:hAnsi="Calibri"/>
+                <w:color w:val="334155"/>
+                <w:sz w:val="17"/>
+              </w:rPr>
+              <w:t>Critical</w:t>
+            </w:r>
+          </w:p>
+        </w:tc>
+        <w:tc>
+          <w:tcPr>
+            <w:tcW w:type="dxa" w:w="2021"/>
+            <w:shd w:fill="F8FAFC"/>
+            <w:tcMar>
+              <w:top w:w="80" w:type="dxa"/>
+              <w:bottom w:w="80" w:type="dxa"/>
+              <w:left w:w="90" w:type="dxa"/>
+              <w:right w:w="90" w:type="dxa"/>
+            </w:tcMar>
+          </w:tcPr>
+          <w:p>
+            <w:pPr>
+              <w:spacing w:after="0"/>
+            </w:pPr>
+            <w:r>
+              <w:rPr>
+                <w:rFonts w:ascii="Calibri" w:hAnsi="Calibri"/>
+                <w:color w:val="334155"/>
+                <w:sz w:val="17"/>
+              </w:rPr>
+              <w:t>Store sandbox receipt; entitlement record; video</w:t>
+            </w:r>
+          </w:p>
+        </w:tc>
+        <w:tc>
+          <w:tcPr>
+            <w:tcW w:type="dxa" w:w="2021"/>
+            <w:shd w:fill="F8FAFC"/>
+            <w:tcMar>
+              <w:top w:w="80" w:type="dxa"/>
+              <w:bottom w:w="80" w:type="dxa"/>
+              <w:left w:w="90" w:type="dxa"/>
+              <w:right w:w="90" w:type="dxa"/>
+            </w:tcMar>
+          </w:tcPr>
+          <w:p>
+            <w:pPr>
+              <w:spacing w:after="0"/>
+            </w:pPr>
+            <w:r>
+              <w:rPr>
+                <w:rFonts w:ascii="Calibri" w:hAnsi="Calibri"/>
+                <w:b/>
+                <w:color w:val="1E3A8A"/>
+                <w:sz w:val="17"/>
+              </w:rPr>
+              <w:t>Commerce Eng / QA</w:t>
+            </w:r>
+          </w:p>
+        </w:tc>
+      </w:tr>
+      <w:tr>
+        <w:tc>
+          <w:tcPr>
+            <w:tcW w:type="dxa" w:w="2021"/>
+            <w:shd w:fill="FFFFFF"/>
+            <w:tcMar>
+              <w:top w:w="80" w:type="dxa"/>
+              <w:bottom w:w="80" w:type="dxa"/>
+              <w:left w:w="90" w:type="dxa"/>
+              <w:right w:w="90" w:type="dxa"/>
+            </w:tcMar>
+          </w:tcPr>
+          <w:p>
+            <w:pPr>
+              <w:spacing w:after="0"/>
+            </w:pPr>
+            <w:r>
+              <w:rPr>
+                <w:rFonts w:ascii="Calibri" w:hAnsi="Calibri"/>
+                <w:b/>
+                <w:color w:val="0F172A"/>
+                <w:sz w:val="17"/>
+              </w:rPr>
+              <w:t>[ ] T3 No-ads entitlement</w:t>
+            </w:r>
+          </w:p>
+        </w:tc>
+        <w:tc>
+          <w:tcPr>
+            <w:tcW w:type="dxa" w:w="2021"/>
+            <w:shd w:fill="FFFFFF"/>
+            <w:tcMar>
+              <w:top w:w="80" w:type="dxa"/>
+              <w:bottom w:w="80" w:type="dxa"/>
+              <w:left w:w="90" w:type="dxa"/>
+              <w:right w:w="90" w:type="dxa"/>
+            </w:tcMar>
+          </w:tcPr>
+          <w:p>
+            <w:pPr>
+              <w:spacing w:after="0"/>
+            </w:pPr>
+            <w:r>
+              <w:rPr>
+                <w:rFonts w:ascii="Calibri" w:hAnsi="Calibri"/>
+                <w:color w:val="334155"/>
+                <w:sz w:val="17"/>
+              </w:rPr>
+              <w:t>No-ads removes every promised forced placement across relaunch, session change, and remote-config refresh; rewarded ads remain voluntary.</w:t>
+            </w:r>
+          </w:p>
+        </w:tc>
+        <w:tc>
+          <w:tcPr>
+            <w:tcW w:type="dxa" w:w="2021"/>
+            <w:shd w:fill="FFFFFF"/>
+            <w:tcMar>
+              <w:top w:w="80" w:type="dxa"/>
+              <w:bottom w:w="80" w:type="dxa"/>
+              <w:left w:w="90" w:type="dxa"/>
+              <w:right w:w="90" w:type="dxa"/>
+            </w:tcMar>
+          </w:tcPr>
+          <w:p>
+            <w:pPr>
+              <w:spacing w:after="0"/>
+            </w:pPr>
+            <w:r>
+              <w:rPr>
+                <w:rFonts w:ascii="Calibri" w:hAnsi="Calibri"/>
+                <w:color w:val="334155"/>
+                <w:sz w:val="17"/>
+              </w:rPr>
+              <w:t>Critical if promise is broken</w:t>
+            </w:r>
+          </w:p>
+        </w:tc>
+        <w:tc>
+          <w:tcPr>
+            <w:tcW w:type="dxa" w:w="2021"/>
+            <w:shd w:fill="FFFFFF"/>
+            <w:tcMar>
+              <w:top w:w="80" w:type="dxa"/>
+              <w:bottom w:w="80" w:type="dxa"/>
+              <w:left w:w="90" w:type="dxa"/>
+              <w:right w:w="90" w:type="dxa"/>
+            </w:tcMar>
+          </w:tcPr>
+          <w:p>
+            <w:pPr>
+              <w:spacing w:after="0"/>
+            </w:pPr>
+            <w:r>
+              <w:rPr>
+                <w:rFonts w:ascii="Calibri" w:hAnsi="Calibri"/>
+                <w:color w:val="334155"/>
+                <w:sz w:val="17"/>
+              </w:rPr>
+              <w:t>Before/after placement map; purchase ID</w:t>
+            </w:r>
+          </w:p>
+        </w:tc>
+        <w:tc>
+          <w:tcPr>
+            <w:tcW w:type="dxa" w:w="2021"/>
+            <w:shd w:fill="FFFFFF"/>
+            <w:tcMar>
+              <w:top w:w="80" w:type="dxa"/>
+              <w:bottom w:w="80" w:type="dxa"/>
+              <w:left w:w="90" w:type="dxa"/>
+              <w:right w:w="90" w:type="dxa"/>
+            </w:tcMar>
+          </w:tcPr>
+          <w:p>
+            <w:pPr>
+              <w:spacing w:after="0"/>
+            </w:pPr>
+            <w:r>
+              <w:rPr>
+                <w:rFonts w:ascii="Calibri" w:hAnsi="Calibri"/>
+                <w:b/>
+                <w:color w:val="1E3A8A"/>
+                <w:sz w:val="17"/>
+              </w:rPr>
+              <w:t>Ads Eng / QA</w:t>
+            </w:r>
+          </w:p>
+        </w:tc>
+      </w:tr>
+      <w:tr>
+        <w:tc>
+          <w:tcPr>
+            <w:tcW w:type="dxa" w:w="2021"/>
+            <w:shd w:fill="F8FAFC"/>
+            <w:tcMar>
+              <w:top w:w="80" w:type="dxa"/>
+              <w:bottom w:w="80" w:type="dxa"/>
+              <w:left w:w="90" w:type="dxa"/>
+              <w:right w:w="90" w:type="dxa"/>
+            </w:tcMar>
+          </w:tcPr>
+          <w:p>
+            <w:pPr>
+              <w:spacing w:after="0"/>
+            </w:pPr>
+            <w:r>
+              <w:rPr>
+                <w:rFonts w:ascii="Calibri" w:hAnsi="Calibri"/>
+                <w:b/>
+                <w:color w:val="0F172A"/>
+                <w:sz w:val="17"/>
+              </w:rPr>
+              <w:t>[ ] T4 Frequency cap &amp; breakpoints</w:t>
+            </w:r>
+          </w:p>
+        </w:tc>
+        <w:tc>
+          <w:tcPr>
+            <w:tcW w:type="dxa" w:w="2021"/>
+            <w:shd w:fill="F8FAFC"/>
+            <w:tcMar>
+              <w:top w:w="80" w:type="dxa"/>
+              <w:bottom w:w="80" w:type="dxa"/>
+              <w:left w:w="90" w:type="dxa"/>
+              <w:right w:w="90" w:type="dxa"/>
+            </w:tcMar>
+          </w:tcPr>
+          <w:p>
+            <w:pPr>
+              <w:spacing w:after="0"/>
+            </w:pPr>
+            <w:r>
+              <w:rPr>
+                <w:rFonts w:ascii="Calibri" w:hAnsi="Calibri"/>
+                <w:color w:val="334155"/>
+                <w:sz w:val="17"/>
+              </w:rPr>
+              <w:t>Interstitial cap holds across level, session, background/resume, and config refresh; no interruption during play, tutorial, or defeat recovery.</w:t>
+            </w:r>
+          </w:p>
+        </w:tc>
+        <w:tc>
+          <w:tcPr>
+            <w:tcW w:type="dxa" w:w="2021"/>
+            <w:shd w:fill="F8FAFC"/>
+            <w:tcMar>
+              <w:top w:w="80" w:type="dxa"/>
+              <w:bottom w:w="80" w:type="dxa"/>
+              <w:left w:w="90" w:type="dxa"/>
+              <w:right w:w="90" w:type="dxa"/>
+            </w:tcMar>
+          </w:tcPr>
+          <w:p>
+            <w:pPr>
+              <w:spacing w:after="0"/>
+            </w:pPr>
+            <w:r>
+              <w:rPr>
+                <w:rFonts w:ascii="Calibri" w:hAnsi="Calibri"/>
+                <w:color w:val="334155"/>
+                <w:sz w:val="17"/>
+              </w:rPr>
+              <w:t>High</w:t>
+            </w:r>
+          </w:p>
+        </w:tc>
+        <w:tc>
+          <w:tcPr>
+            <w:tcW w:type="dxa" w:w="2021"/>
+            <w:shd w:fill="F8FAFC"/>
+            <w:tcMar>
+              <w:top w:w="80" w:type="dxa"/>
+              <w:bottom w:w="80" w:type="dxa"/>
+              <w:left w:w="90" w:type="dxa"/>
+              <w:right w:w="90" w:type="dxa"/>
+            </w:tcMar>
+          </w:tcPr>
+          <w:p>
+            <w:pPr>
+              <w:spacing w:after="0"/>
+            </w:pPr>
+            <w:r>
+              <w:rPr>
+                <w:rFonts w:ascii="Calibri" w:hAnsi="Calibri"/>
+                <w:color w:val="334155"/>
+                <w:sz w:val="17"/>
+              </w:rPr>
+              <w:t>Timestamped session trace; cap config</w:t>
+            </w:r>
+          </w:p>
+        </w:tc>
+        <w:tc>
+          <w:tcPr>
+            <w:tcW w:type="dxa" w:w="2021"/>
+            <w:shd w:fill="F8FAFC"/>
+            <w:tcMar>
+              <w:top w:w="80" w:type="dxa"/>
+              <w:bottom w:w="80" w:type="dxa"/>
+              <w:left w:w="90" w:type="dxa"/>
+              <w:right w:w="90" w:type="dxa"/>
+            </w:tcMar>
+          </w:tcPr>
+          <w:p>
+            <w:pPr>
+              <w:spacing w:after="0"/>
+            </w:pPr>
+            <w:r>
+              <w:rPr>
+                <w:rFonts w:ascii="Calibri" w:hAnsi="Calibri"/>
+                <w:b/>
+                <w:color w:val="1E3A8A"/>
+                <w:sz w:val="17"/>
+              </w:rPr>
+              <w:t>Product / QA</w:t>
+            </w:r>
+          </w:p>
+        </w:tc>
+      </w:tr>
+      <w:tr>
+        <w:tc>
+          <w:tcPr>
+            <w:tcW w:type="dxa" w:w="2021"/>
+            <w:shd w:fill="FFFFFF"/>
+            <w:tcMar>
+              <w:top w:w="80" w:type="dxa"/>
+              <w:bottom w:w="80" w:type="dxa"/>
+              <w:left w:w="90" w:type="dxa"/>
+              <w:right w:w="90" w:type="dxa"/>
+            </w:tcMar>
+          </w:tcPr>
+          <w:p>
+            <w:pPr>
+              <w:spacing w:after="0"/>
+            </w:pPr>
+            <w:r>
+              <w:rPr>
+                <w:rFonts w:ascii="Calibri" w:hAnsi="Calibri"/>
+                <w:b/>
+                <w:color w:val="0F172A"/>
+                <w:sz w:val="17"/>
+              </w:rPr>
+              <w:t>[ ] T5 Consent, price &amp; localization</w:t>
+            </w:r>
+          </w:p>
+        </w:tc>
+        <w:tc>
+          <w:tcPr>
+            <w:tcW w:type="dxa" w:w="2021"/>
+            <w:shd w:fill="FFFFFF"/>
+            <w:tcMar>
+              <w:top w:w="80" w:type="dxa"/>
+              <w:bottom w:w="80" w:type="dxa"/>
+              <w:left w:w="90" w:type="dxa"/>
+              <w:right w:w="90" w:type="dxa"/>
+            </w:tcMar>
+          </w:tcPr>
+          <w:p>
+            <w:pPr>
+              <w:spacing w:after="0"/>
+            </w:pPr>
+            <w:r>
+              <w:rPr>
+                <w:rFonts w:ascii="Calibri" w:hAnsi="Calibri"/>
+                <w:color w:val="334155"/>
+                <w:sz w:val="17"/>
+              </w:rPr>
+              <w:t>ATT/privacy consent is correctly timed; price, currency, tax disclosure, terms, and close/decline path are readable in every target locale.</w:t>
+            </w:r>
+          </w:p>
+        </w:tc>
+        <w:tc>
+          <w:tcPr>
+            <w:tcW w:type="dxa" w:w="2021"/>
+            <w:shd w:fill="FFFFFF"/>
+            <w:tcMar>
+              <w:top w:w="80" w:type="dxa"/>
+              <w:bottom w:w="80" w:type="dxa"/>
+              <w:left w:w="90" w:type="dxa"/>
+              <w:right w:w="90" w:type="dxa"/>
+            </w:tcMar>
+          </w:tcPr>
+          <w:p>
+            <w:pPr>
+              <w:spacing w:after="0"/>
+            </w:pPr>
+            <w:r>
+              <w:rPr>
+                <w:rFonts w:ascii="Calibri" w:hAnsi="Calibri"/>
+                <w:color w:val="334155"/>
+                <w:sz w:val="17"/>
+              </w:rPr>
+              <w:t>Critical for consent or price error</w:t>
+            </w:r>
+          </w:p>
+        </w:tc>
+        <w:tc>
+          <w:tcPr>
+            <w:tcW w:type="dxa" w:w="2021"/>
+            <w:shd w:fill="FFFFFF"/>
+            <w:tcMar>
+              <w:top w:w="80" w:type="dxa"/>
+              <w:bottom w:w="80" w:type="dxa"/>
+              <w:left w:w="90" w:type="dxa"/>
+              <w:right w:w="90" w:type="dxa"/>
+            </w:tcMar>
+          </w:tcPr>
+          <w:p>
+            <w:pPr>
+              <w:spacing w:after="0"/>
+            </w:pPr>
+            <w:r>
+              <w:rPr>
+                <w:rFonts w:ascii="Calibri" w:hAnsi="Calibri"/>
+                <w:color w:val="334155"/>
+                <w:sz w:val="17"/>
+              </w:rPr>
+              <w:t>Locale screenshots; store product config</w:t>
+            </w:r>
+          </w:p>
+        </w:tc>
+        <w:tc>
+          <w:tcPr>
+            <w:tcW w:type="dxa" w:w="2021"/>
+            <w:shd w:fill="FFFFFF"/>
+            <w:tcMar>
+              <w:top w:w="80" w:type="dxa"/>
+              <w:bottom w:w="80" w:type="dxa"/>
+              <w:left w:w="90" w:type="dxa"/>
+              <w:right w:w="90" w:type="dxa"/>
+            </w:tcMar>
+          </w:tcPr>
+          <w:p>
+            <w:pPr>
+              <w:spacing w:after="0"/>
+            </w:pPr>
+            <w:r>
+              <w:rPr>
+                <w:rFonts w:ascii="Calibri" w:hAnsi="Calibri"/>
+                <w:b/>
+                <w:color w:val="1E3A8A"/>
+                <w:sz w:val="17"/>
+              </w:rPr>
+              <w:t>Product / Legal / QA</w:t>
+            </w:r>
+          </w:p>
+        </w:tc>
+      </w:tr>
+      <w:tr>
+        <w:tc>
+          <w:tcPr>
+            <w:tcW w:type="dxa" w:w="2021"/>
+            <w:shd w:fill="F8FAFC"/>
+            <w:tcMar>
+              <w:top w:w="80" w:type="dxa"/>
+              <w:bottom w:w="80" w:type="dxa"/>
+              <w:left w:w="90" w:type="dxa"/>
+              <w:right w:w="90" w:type="dxa"/>
+            </w:tcMar>
+          </w:tcPr>
+          <w:p>
+            <w:pPr>
+              <w:spacing w:after="0"/>
+            </w:pPr>
+            <w:r>
+              <w:rPr>
+                <w:rFonts w:ascii="Calibri" w:hAnsi="Calibri"/>
+                <w:b/>
+                <w:color w:val="0F172A"/>
+                <w:sz w:val="17"/>
+              </w:rPr>
+              <w:t>[ ] T6 Remote config &amp; rollback</w:t>
+            </w:r>
+          </w:p>
+        </w:tc>
+        <w:tc>
+          <w:tcPr>
+            <w:tcW w:type="dxa" w:w="2021"/>
+            <w:shd w:fill="F8FAFC"/>
+            <w:tcMar>
+              <w:top w:w="80" w:type="dxa"/>
+              <w:bottom w:w="80" w:type="dxa"/>
+              <w:left w:w="90" w:type="dxa"/>
+              <w:right w:w="90" w:type="dxa"/>
+            </w:tcMar>
+          </w:tcPr>
+          <w:p>
+            <w:pPr>
+              <w:spacing w:after="0"/>
+            </w:pPr>
+            <w:r>
+              <w:rPr>
+                <w:rFonts w:ascii="Calibri" w:hAnsi="Calibri"/>
+                <w:color w:val="334155"/>
+                <w:sz w:val="17"/>
+              </w:rPr>
+              <w:t>A bad offer, ad rule, economy value, or experiment can be disabled safely without app update; change is logged and verified in production-safe test cohort.</w:t>
+            </w:r>
+          </w:p>
+        </w:tc>
+        <w:tc>
+          <w:tcPr>
+            <w:tcW w:type="dxa" w:w="2021"/>
+            <w:shd w:fill="F8FAFC"/>
+            <w:tcMar>
+              <w:top w:w="80" w:type="dxa"/>
+              <w:bottom w:w="80" w:type="dxa"/>
+              <w:left w:w="90" w:type="dxa"/>
+              <w:right w:w="90" w:type="dxa"/>
+            </w:tcMar>
+          </w:tcPr>
+          <w:p>
+            <w:pPr>
+              <w:spacing w:after="0"/>
+            </w:pPr>
+            <w:r>
+              <w:rPr>
+                <w:rFonts w:ascii="Calibri" w:hAnsi="Calibri"/>
+                <w:color w:val="334155"/>
+                <w:sz w:val="17"/>
+              </w:rPr>
+              <w:t>High</w:t>
+            </w:r>
+          </w:p>
+        </w:tc>
+        <w:tc>
+          <w:tcPr>
+            <w:tcW w:type="dxa" w:w="2021"/>
+            <w:shd w:fill="F8FAFC"/>
+            <w:tcMar>
+              <w:top w:w="80" w:type="dxa"/>
+              <w:bottom w:w="80" w:type="dxa"/>
+              <w:left w:w="90" w:type="dxa"/>
+              <w:right w:w="90" w:type="dxa"/>
+            </w:tcMar>
+          </w:tcPr>
+          <w:p>
+            <w:pPr>
+              <w:spacing w:after="0"/>
+            </w:pPr>
+            <w:r>
+              <w:rPr>
+                <w:rFonts w:ascii="Calibri" w:hAnsi="Calibri"/>
+                <w:color w:val="334155"/>
+                <w:sz w:val="17"/>
+              </w:rPr>
+              <w:t>Config revision; rollback test; owner</w:t>
+            </w:r>
+          </w:p>
+        </w:tc>
+        <w:tc>
+          <w:tcPr>
+            <w:tcW w:type="dxa" w:w="2021"/>
+            <w:shd w:fill="F8FAFC"/>
+            <w:tcMar>
+              <w:top w:w="80" w:type="dxa"/>
+              <w:bottom w:w="80" w:type="dxa"/>
+              <w:left w:w="90" w:type="dxa"/>
+              <w:right w:w="90" w:type="dxa"/>
+            </w:tcMar>
+          </w:tcPr>
+          <w:p>
+            <w:pPr>
+              <w:spacing w:after="0"/>
+            </w:pPr>
+            <w:r>
+              <w:rPr>
+                <w:rFonts w:ascii="Calibri" w:hAnsi="Calibri"/>
+                <w:b/>
+                <w:color w:val="1E3A8A"/>
+                <w:sz w:val="17"/>
+              </w:rPr>
+              <w:t>Live Ops / Eng</w:t>
+            </w:r>
+          </w:p>
+        </w:tc>
+      </w:tr>
+    </w:tbl>
+    <w:p>
+      <w:pPr>
+        <w:spacing w:after="80"/>
+      </w:pPr>
+    </w:p>
+    <w:p>
+      <w:pPr>
+        <w:keepNext/>
+        <w:pageBreakBefore/>
+        <w:spacing w:before="280" w:after="80"/>
+      </w:pPr>
+      <w:r>
+        <w:rPr>
+          <w:rFonts w:ascii="Calibri" w:hAnsi="Calibri"/>
+          <w:b/>
+          <w:color w:val="0F172A"/>
+          <w:sz w:val="30"/>
+        </w:rPr>
+        <w:t>Stage 6: The 10-Point 'Definition of Done' Scale Scorecard</w:t>
+      </w:r>
+    </w:p>
+    <w:p>
+      <w:pPr>
+        <w:spacing w:before="80" w:after="160"/>
+        <w:jc w:val="both"/>
+      </w:pPr>
+      <w:r>
+        <w:rPr>
+          <w:rFonts w:ascii="Calibri" w:hAnsi="Calibri"/>
+          <w:i/>
+          <w:color w:val="334155"/>
+          <w:sz w:val="19"/>
+        </w:rPr>
+        <w:t>Scale decision: Minimum score of 9/10 AND zero Critical failures across this scorecard and Technical QA. A missing evidence record is not a pass. Any N/A needs a documented stage rationale and a named re-review date.</w:t>
+      </w:r>
+    </w:p>
+    <w:tbl>
+      <w:tblPr>
+        <w:tblW w:type="auto" w:w="0"/>
+        <w:jc w:val="center"/>
+        <w:tblLook w:firstColumn="1" w:firstRow="1" w:lastColumn="0" w:lastRow="0" w:noHBand="0" w:noVBand="1" w:val="04A0"/>
+        <w:tblBorders>
+          <w:top w:val="single" w:sz="4" w:space="0" w:color="CBD5E1"/>
+          <w:bottom w:val="single" w:sz="4" w:space="0" w:color="CBD5E1"/>
+          <w:left w:val="single" w:sz="4" w:space="0" w:color="CBD5E1"/>
+          <w:right w:val="single" w:sz="4" w:space="0" w:color="CBD5E1"/>
+          <w:insideH w:val="single" w:sz="4" w:space="0" w:color="CBD5E1"/>
+          <w:insideV w:val="single" w:sz="4" w:space="0" w:color="CBD5E1"/>
+        </w:tblBorders>
+      </w:tblPr>
+      <w:tblGrid>
+        <w:gridCol w:w="2526"/>
+        <w:gridCol w:w="2526"/>
+        <w:gridCol w:w="2526"/>
+        <w:gridCol w:w="2526"/>
+      </w:tblGrid>
+      <w:tr>
+        <w:trPr>
+          <w:tblHeader/>
+        </w:trPr>
+        <w:tc>
+          <w:tcPr>
+            <w:tcW w:type="dxa" w:w="2526"/>
             <w:shd w:fill="0F172A"/>
             <w:tcMar>
               <w:top w:w="100" w:type="dxa"/>
@@ -3523,7 +6004,7 @@
         </w:tc>
         <w:tc>
           <w:tcPr>
-            <w:tcW w:type="dxa" w:w="3369"/>
+            <w:tcW w:type="dxa" w:w="2526"/>
             <w:shd w:fill="0F172A"/>
             <w:tcMar>
               <w:top w:w="100" w:type="dxa"/>
@@ -3549,7 +6030,7 @@
         </w:tc>
         <w:tc>
           <w:tcPr>
-            <w:tcW w:type="dxa" w:w="3369"/>
+            <w:tcW w:type="dxa" w:w="2526"/>
             <w:shd w:fill="0F172A"/>
             <w:tcMar>
               <w:top w:w="100" w:type="dxa"/>
@@ -3569,7 +6050,33 @@
                 <w:color w:val="FFFFFF"/>
                 <w:sz w:val="17"/>
               </w:rPr>
-              <w:t>Status [Pass / Fail]</w:t>
+              <w:t>Evidence / Owner</w:t>
+            </w:r>
+          </w:p>
+        </w:tc>
+        <w:tc>
+          <w:tcPr>
+            <w:tcW w:type="dxa" w:w="2526"/>
+            <w:shd w:fill="0F172A"/>
+            <w:tcMar>
+              <w:top w:w="100" w:type="dxa"/>
+              <w:bottom w:w="100" w:type="dxa"/>
+              <w:left w:w="100" w:type="dxa"/>
+              <w:right w:w="100" w:type="dxa"/>
+            </w:tcMar>
+          </w:tcPr>
+          <w:p>
+            <w:pPr>
+              <w:spacing w:after="0"/>
+            </w:pPr>
+            <w:r>
+              <w:rPr>
+                <w:rFonts w:ascii="Calibri" w:hAnsi="Calibri"/>
+                <w:b/>
+                <w:color w:val="FFFFFF"/>
+                <w:sz w:val="17"/>
+              </w:rPr>
+              <w:t>Status</w:t>
             </w:r>
           </w:p>
         </w:tc>
@@ -3577,7 +6084,7 @@
       <w:tr>
         <w:tc>
           <w:tcPr>
-            <w:tcW w:type="dxa" w:w="3369"/>
+            <w:tcW w:type="dxa" w:w="2526"/>
             <w:shd w:fill="FFFFFF"/>
             <w:tcMar>
               <w:top w:w="80" w:type="dxa"/>
@@ -3603,7 +6110,7 @@
         </w:tc>
         <w:tc>
           <w:tcPr>
-            <w:tcW w:type="dxa" w:w="3369"/>
+            <w:tcW w:type="dxa" w:w="2526"/>
             <w:shd w:fill="FFFFFF"/>
             <w:tcMar>
               <w:top w:w="80" w:type="dxa"/>
@@ -3628,7 +6135,7 @@
         </w:tc>
         <w:tc>
           <w:tcPr>
-            <w:tcW w:type="dxa" w:w="3369"/>
+            <w:tcW w:type="dxa" w:w="2526"/>
             <w:shd w:fill="FFFFFF"/>
             <w:tcMar>
               <w:top w:w="80" w:type="dxa"/>
@@ -3647,7 +6154,32 @@
                 <w:color w:val="334155"/>
                 <w:sz w:val="17"/>
               </w:rPr>
-              <w:t>[   ] PASS   /   [   ] FAIL</w:t>
+              <w:t>[link / cohort / DRI]</w:t>
+            </w:r>
+          </w:p>
+        </w:tc>
+        <w:tc>
+          <w:tcPr>
+            <w:tcW w:type="dxa" w:w="2526"/>
+            <w:shd w:fill="FFFFFF"/>
+            <w:tcMar>
+              <w:top w:w="80" w:type="dxa"/>
+              <w:bottom w:w="80" w:type="dxa"/>
+              <w:left w:w="90" w:type="dxa"/>
+              <w:right w:w="90" w:type="dxa"/>
+            </w:tcMar>
+          </w:tcPr>
+          <w:p>
+            <w:pPr>
+              <w:spacing w:after="0"/>
+            </w:pPr>
+            <w:r>
+              <w:rPr>
+                <w:rFonts w:ascii="Calibri" w:hAnsi="Calibri"/>
+                <w:color w:val="334155"/>
+                <w:sz w:val="17"/>
+              </w:rPr>
+              <w:t>[PASS / FAIL / N/A]</w:t>
             </w:r>
           </w:p>
         </w:tc>
@@ -3655,7 +6187,7 @@
       <w:tr>
         <w:tc>
           <w:tcPr>
-            <w:tcW w:type="dxa" w:w="3369"/>
+            <w:tcW w:type="dxa" w:w="2526"/>
             <w:shd w:fill="F8FAFC"/>
             <w:tcMar>
               <w:top w:w="80" w:type="dxa"/>
@@ -3681,7 +6213,7 @@
         </w:tc>
         <w:tc>
           <w:tcPr>
-            <w:tcW w:type="dxa" w:w="3369"/>
+            <w:tcW w:type="dxa" w:w="2526"/>
             <w:shd w:fill="F8FAFC"/>
             <w:tcMar>
               <w:top w:w="80" w:type="dxa"/>
@@ -3706,7 +6238,7 @@
         </w:tc>
         <w:tc>
           <w:tcPr>
-            <w:tcW w:type="dxa" w:w="3369"/>
+            <w:tcW w:type="dxa" w:w="2526"/>
             <w:shd w:fill="F8FAFC"/>
             <w:tcMar>
               <w:top w:w="80" w:type="dxa"/>
@@ -3725,7 +6257,32 @@
                 <w:color w:val="334155"/>
                 <w:sz w:val="17"/>
               </w:rPr>
-              <w:t>[   ] PASS   /   [   ] FAIL</w:t>
+              <w:t>[link / cohort / DRI]</w:t>
+            </w:r>
+          </w:p>
+        </w:tc>
+        <w:tc>
+          <w:tcPr>
+            <w:tcW w:type="dxa" w:w="2526"/>
+            <w:shd w:fill="F8FAFC"/>
+            <w:tcMar>
+              <w:top w:w="80" w:type="dxa"/>
+              <w:bottom w:w="80" w:type="dxa"/>
+              <w:left w:w="90" w:type="dxa"/>
+              <w:right w:w="90" w:type="dxa"/>
+            </w:tcMar>
+          </w:tcPr>
+          <w:p>
+            <w:pPr>
+              <w:spacing w:after="0"/>
+            </w:pPr>
+            <w:r>
+              <w:rPr>
+                <w:rFonts w:ascii="Calibri" w:hAnsi="Calibri"/>
+                <w:color w:val="334155"/>
+                <w:sz w:val="17"/>
+              </w:rPr>
+              <w:t>[PASS / FAIL / N/A]</w:t>
             </w:r>
           </w:p>
         </w:tc>
@@ -3733,7 +6290,7 @@
       <w:tr>
         <w:tc>
           <w:tcPr>
-            <w:tcW w:type="dxa" w:w="3369"/>
+            <w:tcW w:type="dxa" w:w="2526"/>
             <w:shd w:fill="FFFFFF"/>
             <w:tcMar>
               <w:top w:w="80" w:type="dxa"/>
@@ -3759,7 +6316,7 @@
         </w:tc>
         <w:tc>
           <w:tcPr>
-            <w:tcW w:type="dxa" w:w="3369"/>
+            <w:tcW w:type="dxa" w:w="2526"/>
             <w:shd w:fill="FFFFFF"/>
             <w:tcMar>
               <w:top w:w="80" w:type="dxa"/>
@@ -3784,7 +6341,7 @@
         </w:tc>
         <w:tc>
           <w:tcPr>
-            <w:tcW w:type="dxa" w:w="3369"/>
+            <w:tcW w:type="dxa" w:w="2526"/>
             <w:shd w:fill="FFFFFF"/>
             <w:tcMar>
               <w:top w:w="80" w:type="dxa"/>
@@ -3803,7 +6360,32 @@
                 <w:color w:val="334155"/>
                 <w:sz w:val="17"/>
               </w:rPr>
-              <w:t>[   ] PASS   /   [   ] FAIL</w:t>
+              <w:t>[link / cohort / DRI]</w:t>
+            </w:r>
+          </w:p>
+        </w:tc>
+        <w:tc>
+          <w:tcPr>
+            <w:tcW w:type="dxa" w:w="2526"/>
+            <w:shd w:fill="FFFFFF"/>
+            <w:tcMar>
+              <w:top w:w="80" w:type="dxa"/>
+              <w:bottom w:w="80" w:type="dxa"/>
+              <w:left w:w="90" w:type="dxa"/>
+              <w:right w:w="90" w:type="dxa"/>
+            </w:tcMar>
+          </w:tcPr>
+          <w:p>
+            <w:pPr>
+              <w:spacing w:after="0"/>
+            </w:pPr>
+            <w:r>
+              <w:rPr>
+                <w:rFonts w:ascii="Calibri" w:hAnsi="Calibri"/>
+                <w:color w:val="334155"/>
+                <w:sz w:val="17"/>
+              </w:rPr>
+              <w:t>[PASS / FAIL / N/A]</w:t>
             </w:r>
           </w:p>
         </w:tc>
@@ -3811,7 +6393,7 @@
       <w:tr>
         <w:tc>
           <w:tcPr>
-            <w:tcW w:type="dxa" w:w="3369"/>
+            <w:tcW w:type="dxa" w:w="2526"/>
             <w:shd w:fill="F8FAFC"/>
             <w:tcMar>
               <w:top w:w="80" w:type="dxa"/>
@@ -3837,7 +6419,7 @@
         </w:tc>
         <w:tc>
           <w:tcPr>
-            <w:tcW w:type="dxa" w:w="3369"/>
+            <w:tcW w:type="dxa" w:w="2526"/>
             <w:shd w:fill="F8FAFC"/>
             <w:tcMar>
               <w:top w:w="80" w:type="dxa"/>
@@ -3862,7 +6444,7 @@
         </w:tc>
         <w:tc>
           <w:tcPr>
-            <w:tcW w:type="dxa" w:w="3369"/>
+            <w:tcW w:type="dxa" w:w="2526"/>
             <w:shd w:fill="F8FAFC"/>
             <w:tcMar>
               <w:top w:w="80" w:type="dxa"/>
@@ -3881,7 +6463,32 @@
                 <w:color w:val="334155"/>
                 <w:sz w:val="17"/>
               </w:rPr>
-              <w:t>[   ] PASS   /   [   ] FAIL</w:t>
+              <w:t>[link / cohort / DRI]</w:t>
+            </w:r>
+          </w:p>
+        </w:tc>
+        <w:tc>
+          <w:tcPr>
+            <w:tcW w:type="dxa" w:w="2526"/>
+            <w:shd w:fill="F8FAFC"/>
+            <w:tcMar>
+              <w:top w:w="80" w:type="dxa"/>
+              <w:bottom w:w="80" w:type="dxa"/>
+              <w:left w:w="90" w:type="dxa"/>
+              <w:right w:w="90" w:type="dxa"/>
+            </w:tcMar>
+          </w:tcPr>
+          <w:p>
+            <w:pPr>
+              <w:spacing w:after="0"/>
+            </w:pPr>
+            <w:r>
+              <w:rPr>
+                <w:rFonts w:ascii="Calibri" w:hAnsi="Calibri"/>
+                <w:color w:val="334155"/>
+                <w:sz w:val="17"/>
+              </w:rPr>
+              <w:t>[PASS / FAIL / N/A]</w:t>
             </w:r>
           </w:p>
         </w:tc>
@@ -3889,7 +6496,7 @@
       <w:tr>
         <w:tc>
           <w:tcPr>
-            <w:tcW w:type="dxa" w:w="3369"/>
+            <w:tcW w:type="dxa" w:w="2526"/>
             <w:shd w:fill="FFFFFF"/>
             <w:tcMar>
               <w:top w:w="80" w:type="dxa"/>
@@ -3915,7 +6522,7 @@
         </w:tc>
         <w:tc>
           <w:tcPr>
-            <w:tcW w:type="dxa" w:w="3369"/>
+            <w:tcW w:type="dxa" w:w="2526"/>
             <w:shd w:fill="FFFFFF"/>
             <w:tcMar>
               <w:top w:w="80" w:type="dxa"/>
@@ -3940,7 +6547,7 @@
         </w:tc>
         <w:tc>
           <w:tcPr>
-            <w:tcW w:type="dxa" w:w="3369"/>
+            <w:tcW w:type="dxa" w:w="2526"/>
             <w:shd w:fill="FFFFFF"/>
             <w:tcMar>
               <w:top w:w="80" w:type="dxa"/>
@@ -3959,7 +6566,32 @@
                 <w:color w:val="334155"/>
                 <w:sz w:val="17"/>
               </w:rPr>
-              <w:t>[   ] PASS   /   [   ] FAIL</w:t>
+              <w:t>[link / cohort / DRI]</w:t>
+            </w:r>
+          </w:p>
+        </w:tc>
+        <w:tc>
+          <w:tcPr>
+            <w:tcW w:type="dxa" w:w="2526"/>
+            <w:shd w:fill="FFFFFF"/>
+            <w:tcMar>
+              <w:top w:w="80" w:type="dxa"/>
+              <w:bottom w:w="80" w:type="dxa"/>
+              <w:left w:w="90" w:type="dxa"/>
+              <w:right w:w="90" w:type="dxa"/>
+            </w:tcMar>
+          </w:tcPr>
+          <w:p>
+            <w:pPr>
+              <w:spacing w:after="0"/>
+            </w:pPr>
+            <w:r>
+              <w:rPr>
+                <w:rFonts w:ascii="Calibri" w:hAnsi="Calibri"/>
+                <w:color w:val="334155"/>
+                <w:sz w:val="17"/>
+              </w:rPr>
+              <w:t>[PASS / FAIL / N/A]</w:t>
             </w:r>
           </w:p>
         </w:tc>
@@ -3967,7 +6599,7 @@
       <w:tr>
         <w:tc>
           <w:tcPr>
-            <w:tcW w:type="dxa" w:w="3369"/>
+            <w:tcW w:type="dxa" w:w="2526"/>
             <w:shd w:fill="F8FAFC"/>
             <w:tcMar>
               <w:top w:w="80" w:type="dxa"/>
@@ -3993,7 +6625,7 @@
         </w:tc>
         <w:tc>
           <w:tcPr>
-            <w:tcW w:type="dxa" w:w="3369"/>
+            <w:tcW w:type="dxa" w:w="2526"/>
             <w:shd w:fill="F8FAFC"/>
             <w:tcMar>
               <w:top w:w="80" w:type="dxa"/>
@@ -4018,7 +6650,7 @@
         </w:tc>
         <w:tc>
           <w:tcPr>
-            <w:tcW w:type="dxa" w:w="3369"/>
+            <w:tcW w:type="dxa" w:w="2526"/>
             <w:shd w:fill="F8FAFC"/>
             <w:tcMar>
               <w:top w:w="80" w:type="dxa"/>
@@ -4037,7 +6669,32 @@
                 <w:color w:val="334155"/>
                 <w:sz w:val="17"/>
               </w:rPr>
-              <w:t>[   ] PASS   /   [   ] FAIL</w:t>
+              <w:t>[link / cohort / DRI]</w:t>
+            </w:r>
+          </w:p>
+        </w:tc>
+        <w:tc>
+          <w:tcPr>
+            <w:tcW w:type="dxa" w:w="2526"/>
+            <w:shd w:fill="F8FAFC"/>
+            <w:tcMar>
+              <w:top w:w="80" w:type="dxa"/>
+              <w:bottom w:w="80" w:type="dxa"/>
+              <w:left w:w="90" w:type="dxa"/>
+              <w:right w:w="90" w:type="dxa"/>
+            </w:tcMar>
+          </w:tcPr>
+          <w:p>
+            <w:pPr>
+              <w:spacing w:after="0"/>
+            </w:pPr>
+            <w:r>
+              <w:rPr>
+                <w:rFonts w:ascii="Calibri" w:hAnsi="Calibri"/>
+                <w:color w:val="334155"/>
+                <w:sz w:val="17"/>
+              </w:rPr>
+              <w:t>[PASS / FAIL / N/A]</w:t>
             </w:r>
           </w:p>
         </w:tc>
@@ -4045,7 +6702,7 @@
       <w:tr>
         <w:tc>
           <w:tcPr>
-            <w:tcW w:type="dxa" w:w="3369"/>
+            <w:tcW w:type="dxa" w:w="2526"/>
             <w:shd w:fill="FFFFFF"/>
             <w:tcMar>
               <w:top w:w="80" w:type="dxa"/>
@@ -4071,7 +6728,7 @@
         </w:tc>
         <w:tc>
           <w:tcPr>
-            <w:tcW w:type="dxa" w:w="3369"/>
+            <w:tcW w:type="dxa" w:w="2526"/>
             <w:shd w:fill="FFFFFF"/>
             <w:tcMar>
               <w:top w:w="80" w:type="dxa"/>
@@ -4096,7 +6753,7 @@
         </w:tc>
         <w:tc>
           <w:tcPr>
-            <w:tcW w:type="dxa" w:w="3369"/>
+            <w:tcW w:type="dxa" w:w="2526"/>
             <w:shd w:fill="FFFFFF"/>
             <w:tcMar>
               <w:top w:w="80" w:type="dxa"/>
@@ -4115,7 +6772,32 @@
                 <w:color w:val="334155"/>
                 <w:sz w:val="17"/>
               </w:rPr>
-              <w:t>[   ] PASS   /   [   ] FAIL</w:t>
+              <w:t>[link / cohort / DRI]</w:t>
+            </w:r>
+          </w:p>
+        </w:tc>
+        <w:tc>
+          <w:tcPr>
+            <w:tcW w:type="dxa" w:w="2526"/>
+            <w:shd w:fill="FFFFFF"/>
+            <w:tcMar>
+              <w:top w:w="80" w:type="dxa"/>
+              <w:bottom w:w="80" w:type="dxa"/>
+              <w:left w:w="90" w:type="dxa"/>
+              <w:right w:w="90" w:type="dxa"/>
+            </w:tcMar>
+          </w:tcPr>
+          <w:p>
+            <w:pPr>
+              <w:spacing w:after="0"/>
+            </w:pPr>
+            <w:r>
+              <w:rPr>
+                <w:rFonts w:ascii="Calibri" w:hAnsi="Calibri"/>
+                <w:color w:val="334155"/>
+                <w:sz w:val="17"/>
+              </w:rPr>
+              <w:t>[PASS / FAIL / N/A]</w:t>
             </w:r>
           </w:p>
         </w:tc>
@@ -4123,7 +6805,7 @@
       <w:tr>
         <w:tc>
           <w:tcPr>
-            <w:tcW w:type="dxa" w:w="3369"/>
+            <w:tcW w:type="dxa" w:w="2526"/>
             <w:shd w:fill="F8FAFC"/>
             <w:tcMar>
               <w:top w:w="80" w:type="dxa"/>
@@ -4149,7 +6831,7 @@
         </w:tc>
         <w:tc>
           <w:tcPr>
-            <w:tcW w:type="dxa" w:w="3369"/>
+            <w:tcW w:type="dxa" w:w="2526"/>
             <w:shd w:fill="F8FAFC"/>
             <w:tcMar>
               <w:top w:w="80" w:type="dxa"/>
@@ -4174,7 +6856,7 @@
         </w:tc>
         <w:tc>
           <w:tcPr>
-            <w:tcW w:type="dxa" w:w="3369"/>
+            <w:tcW w:type="dxa" w:w="2526"/>
             <w:shd w:fill="F8FAFC"/>
             <w:tcMar>
               <w:top w:w="80" w:type="dxa"/>
@@ -4193,7 +6875,32 @@
                 <w:color w:val="334155"/>
                 <w:sz w:val="17"/>
               </w:rPr>
-              <w:t>[   ] PASS   /   [   ] FAIL</w:t>
+              <w:t>[link / cohort / DRI]</w:t>
+            </w:r>
+          </w:p>
+        </w:tc>
+        <w:tc>
+          <w:tcPr>
+            <w:tcW w:type="dxa" w:w="2526"/>
+            <w:shd w:fill="F8FAFC"/>
+            <w:tcMar>
+              <w:top w:w="80" w:type="dxa"/>
+              <w:bottom w:w="80" w:type="dxa"/>
+              <w:left w:w="90" w:type="dxa"/>
+              <w:right w:w="90" w:type="dxa"/>
+            </w:tcMar>
+          </w:tcPr>
+          <w:p>
+            <w:pPr>
+              <w:spacing w:after="0"/>
+            </w:pPr>
+            <w:r>
+              <w:rPr>
+                <w:rFonts w:ascii="Calibri" w:hAnsi="Calibri"/>
+                <w:color w:val="334155"/>
+                <w:sz w:val="17"/>
+              </w:rPr>
+              <w:t>[PASS / FAIL / N/A]</w:t>
             </w:r>
           </w:p>
         </w:tc>
@@ -4201,7 +6908,7 @@
       <w:tr>
         <w:tc>
           <w:tcPr>
-            <w:tcW w:type="dxa" w:w="3369"/>
+            <w:tcW w:type="dxa" w:w="2526"/>
             <w:shd w:fill="FFFFFF"/>
             <w:tcMar>
               <w:top w:w="80" w:type="dxa"/>
@@ -4227,7 +6934,7 @@
         </w:tc>
         <w:tc>
           <w:tcPr>
-            <w:tcW w:type="dxa" w:w="3369"/>
+            <w:tcW w:type="dxa" w:w="2526"/>
             <w:shd w:fill="FFFFFF"/>
             <w:tcMar>
               <w:top w:w="80" w:type="dxa"/>
@@ -4252,7 +6959,7 @@
         </w:tc>
         <w:tc>
           <w:tcPr>
-            <w:tcW w:type="dxa" w:w="3369"/>
+            <w:tcW w:type="dxa" w:w="2526"/>
             <w:shd w:fill="FFFFFF"/>
             <w:tcMar>
               <w:top w:w="80" w:type="dxa"/>
@@ -4271,7 +6978,32 @@
                 <w:color w:val="334155"/>
                 <w:sz w:val="17"/>
               </w:rPr>
-              <w:t>[   ] PASS   /   [   ] FAIL</w:t>
+              <w:t>[link / cohort / DRI]</w:t>
+            </w:r>
+          </w:p>
+        </w:tc>
+        <w:tc>
+          <w:tcPr>
+            <w:tcW w:type="dxa" w:w="2526"/>
+            <w:shd w:fill="FFFFFF"/>
+            <w:tcMar>
+              <w:top w:w="80" w:type="dxa"/>
+              <w:bottom w:w="80" w:type="dxa"/>
+              <w:left w:w="90" w:type="dxa"/>
+              <w:right w:w="90" w:type="dxa"/>
+            </w:tcMar>
+          </w:tcPr>
+          <w:p>
+            <w:pPr>
+              <w:spacing w:after="0"/>
+            </w:pPr>
+            <w:r>
+              <w:rPr>
+                <w:rFonts w:ascii="Calibri" w:hAnsi="Calibri"/>
+                <w:color w:val="334155"/>
+                <w:sz w:val="17"/>
+              </w:rPr>
+              <w:t>[PASS / FAIL / N/A]</w:t>
             </w:r>
           </w:p>
         </w:tc>
@@ -4279,7 +7011,7 @@
       <w:tr>
         <w:tc>
           <w:tcPr>
-            <w:tcW w:type="dxa" w:w="3369"/>
+            <w:tcW w:type="dxa" w:w="2526"/>
             <w:shd w:fill="F8FAFC"/>
             <w:tcMar>
               <w:top w:w="80" w:type="dxa"/>
@@ -4305,7 +7037,7 @@
         </w:tc>
         <w:tc>
           <w:tcPr>
-            <w:tcW w:type="dxa" w:w="3369"/>
+            <w:tcW w:type="dxa" w:w="2526"/>
             <w:shd w:fill="F8FAFC"/>
             <w:tcMar>
               <w:top w:w="80" w:type="dxa"/>
@@ -4330,7 +7062,7 @@
         </w:tc>
         <w:tc>
           <w:tcPr>
-            <w:tcW w:type="dxa" w:w="3369"/>
+            <w:tcW w:type="dxa" w:w="2526"/>
             <w:shd w:fill="F8FAFC"/>
             <w:tcMar>
               <w:top w:w="80" w:type="dxa"/>
@@ -4349,7 +7081,285 @@
                 <w:color w:val="334155"/>
                 <w:sz w:val="17"/>
               </w:rPr>
-              <w:t>[   ] PASS   /   [   ] FAIL</w:t>
+              <w:t>[link / cohort / DRI]</w:t>
+            </w:r>
+          </w:p>
+        </w:tc>
+        <w:tc>
+          <w:tcPr>
+            <w:tcW w:type="dxa" w:w="2526"/>
+            <w:shd w:fill="F8FAFC"/>
+            <w:tcMar>
+              <w:top w:w="80" w:type="dxa"/>
+              <w:bottom w:w="80" w:type="dxa"/>
+              <w:left w:w="90" w:type="dxa"/>
+              <w:right w:w="90" w:type="dxa"/>
+            </w:tcMar>
+          </w:tcPr>
+          <w:p>
+            <w:pPr>
+              <w:spacing w:after="0"/>
+            </w:pPr>
+            <w:r>
+              <w:rPr>
+                <w:rFonts w:ascii="Calibri" w:hAnsi="Calibri"/>
+                <w:color w:val="334155"/>
+                <w:sz w:val="17"/>
+              </w:rPr>
+              <w:t>[PASS / FAIL / N/A]</w:t>
+            </w:r>
+          </w:p>
+        </w:tc>
+      </w:tr>
+    </w:tbl>
+    <w:p>
+      <w:pPr>
+        <w:spacing w:after="80"/>
+      </w:pPr>
+    </w:p>
+    <w:p>
+      <w:pPr>
+        <w:keepNext/>
+        <w:spacing w:before="240" w:after="80"/>
+      </w:pPr>
+      <w:r>
+        <w:rPr>
+          <w:rFonts w:ascii="Calibri" w:hAnsi="Calibri"/>
+          <w:b/>
+          <w:color w:val="1E3A8A"/>
+          <w:sz w:val="24"/>
+        </w:rPr>
+        <w:t>Scale Decision Record</w:t>
+      </w:r>
+    </w:p>
+    <w:tbl>
+      <w:tblPr>
+        <w:tblW w:type="auto" w:w="0"/>
+        <w:jc w:val="center"/>
+        <w:tblLook w:firstColumn="1" w:firstRow="1" w:lastColumn="0" w:lastRow="0" w:noHBand="0" w:noVBand="1" w:val="04A0"/>
+        <w:tblBorders>
+          <w:top w:val="single" w:sz="4" w:space="0" w:color="CBD5E1"/>
+          <w:bottom w:val="single" w:sz="4" w:space="0" w:color="CBD5E1"/>
+          <w:left w:val="single" w:sz="4" w:space="0" w:color="CBD5E1"/>
+          <w:right w:val="single" w:sz="4" w:space="0" w:color="CBD5E1"/>
+          <w:insideH w:val="single" w:sz="4" w:space="0" w:color="CBD5E1"/>
+          <w:insideV w:val="single" w:sz="4" w:space="0" w:color="CBD5E1"/>
+        </w:tblBorders>
+      </w:tblPr>
+      <w:tblGrid>
+        <w:gridCol w:w="2526"/>
+        <w:gridCol w:w="2526"/>
+        <w:gridCol w:w="2526"/>
+        <w:gridCol w:w="2526"/>
+      </w:tblGrid>
+      <w:tr>
+        <w:trPr>
+          <w:tblHeader/>
+        </w:trPr>
+        <w:tc>
+          <w:tcPr>
+            <w:tcW w:type="dxa" w:w="2526"/>
+            <w:shd w:fill="0F172A"/>
+            <w:tcMar>
+              <w:top w:w="100" w:type="dxa"/>
+              <w:bottom w:w="100" w:type="dxa"/>
+              <w:left w:w="100" w:type="dxa"/>
+              <w:right w:w="100" w:type="dxa"/>
+            </w:tcMar>
+          </w:tcPr>
+          <w:p>
+            <w:pPr>
+              <w:spacing w:after="0"/>
+            </w:pPr>
+            <w:r>
+              <w:rPr>
+                <w:rFonts w:ascii="Calibri" w:hAnsi="Calibri"/>
+                <w:b/>
+                <w:color w:val="FFFFFF"/>
+                <w:sz w:val="17"/>
+              </w:rPr>
+              <w:t>Decision</w:t>
+            </w:r>
+          </w:p>
+        </w:tc>
+        <w:tc>
+          <w:tcPr>
+            <w:tcW w:type="dxa" w:w="2526"/>
+            <w:shd w:fill="0F172A"/>
+            <w:tcMar>
+              <w:top w:w="100" w:type="dxa"/>
+              <w:bottom w:w="100" w:type="dxa"/>
+              <w:left w:w="100" w:type="dxa"/>
+              <w:right w:w="100" w:type="dxa"/>
+            </w:tcMar>
+          </w:tcPr>
+          <w:p>
+            <w:pPr>
+              <w:spacing w:after="0"/>
+            </w:pPr>
+            <w:r>
+              <w:rPr>
+                <w:rFonts w:ascii="Calibri" w:hAnsi="Calibri"/>
+                <w:b/>
+                <w:color w:val="FFFFFF"/>
+                <w:sz w:val="17"/>
+              </w:rPr>
+              <w:t>Required sign-off</w:t>
+            </w:r>
+          </w:p>
+        </w:tc>
+        <w:tc>
+          <w:tcPr>
+            <w:tcW w:type="dxa" w:w="2526"/>
+            <w:shd w:fill="0F172A"/>
+            <w:tcMar>
+              <w:top w:w="100" w:type="dxa"/>
+              <w:bottom w:w="100" w:type="dxa"/>
+              <w:left w:w="100" w:type="dxa"/>
+              <w:right w:w="100" w:type="dxa"/>
+            </w:tcMar>
+          </w:tcPr>
+          <w:p>
+            <w:pPr>
+              <w:spacing w:after="0"/>
+            </w:pPr>
+            <w:r>
+              <w:rPr>
+                <w:rFonts w:ascii="Calibri" w:hAnsi="Calibri"/>
+                <w:b/>
+                <w:color w:val="FFFFFF"/>
+                <w:sz w:val="17"/>
+              </w:rPr>
+              <w:t>Reason / evidence</w:t>
+            </w:r>
+          </w:p>
+        </w:tc>
+        <w:tc>
+          <w:tcPr>
+            <w:tcW w:type="dxa" w:w="2526"/>
+            <w:shd w:fill="0F172A"/>
+            <w:tcMar>
+              <w:top w:w="100" w:type="dxa"/>
+              <w:bottom w:w="100" w:type="dxa"/>
+              <w:left w:w="100" w:type="dxa"/>
+              <w:right w:w="100" w:type="dxa"/>
+            </w:tcMar>
+          </w:tcPr>
+          <w:p>
+            <w:pPr>
+              <w:spacing w:after="0"/>
+            </w:pPr>
+            <w:r>
+              <w:rPr>
+                <w:rFonts w:ascii="Calibri" w:hAnsi="Calibri"/>
+                <w:b/>
+                <w:color w:val="FFFFFF"/>
+                <w:sz w:val="17"/>
+              </w:rPr>
+              <w:t>Next review date</w:t>
+            </w:r>
+          </w:p>
+        </w:tc>
+      </w:tr>
+      <w:tr>
+        <w:tc>
+          <w:tcPr>
+            <w:tcW w:type="dxa" w:w="2526"/>
+            <w:shd w:fill="FFFFFF"/>
+            <w:tcMar>
+              <w:top w:w="80" w:type="dxa"/>
+              <w:bottom w:w="80" w:type="dxa"/>
+              <w:left w:w="90" w:type="dxa"/>
+              <w:right w:w="90" w:type="dxa"/>
+            </w:tcMar>
+          </w:tcPr>
+          <w:p>
+            <w:pPr>
+              <w:spacing w:after="0"/>
+            </w:pPr>
+            <w:r>
+              <w:rPr>
+                <w:rFonts w:ascii="Calibri" w:hAnsi="Calibri"/>
+                <w:b/>
+                <w:color w:val="0F172A"/>
+                <w:sz w:val="17"/>
+              </w:rPr>
+              <w:t>[Scale / Hold / Iterate / Kill]</w:t>
+            </w:r>
+          </w:p>
+        </w:tc>
+        <w:tc>
+          <w:tcPr>
+            <w:tcW w:type="dxa" w:w="2526"/>
+            <w:shd w:fill="FFFFFF"/>
+            <w:tcMar>
+              <w:top w:w="80" w:type="dxa"/>
+              <w:bottom w:w="80" w:type="dxa"/>
+              <w:left w:w="90" w:type="dxa"/>
+              <w:right w:w="90" w:type="dxa"/>
+            </w:tcMar>
+          </w:tcPr>
+          <w:p>
+            <w:pPr>
+              <w:spacing w:after="0"/>
+            </w:pPr>
+            <w:r>
+              <w:rPr>
+                <w:rFonts w:ascii="Calibri" w:hAnsi="Calibri"/>
+                <w:color w:val="334155"/>
+                <w:sz w:val="17"/>
+              </w:rPr>
+              <w:t>Product Lead: [ ]  Data Lead: [ ]  Monetization Lead: [ ]  QA Lead: [ ]</w:t>
+            </w:r>
+          </w:p>
+        </w:tc>
+        <w:tc>
+          <w:tcPr>
+            <w:tcW w:type="dxa" w:w="2526"/>
+            <w:shd w:fill="FFFFFF"/>
+            <w:tcMar>
+              <w:top w:w="80" w:type="dxa"/>
+              <w:bottom w:w="80" w:type="dxa"/>
+              <w:left w:w="90" w:type="dxa"/>
+              <w:right w:w="90" w:type="dxa"/>
+            </w:tcMar>
+          </w:tcPr>
+          <w:p>
+            <w:pPr>
+              <w:spacing w:after="0"/>
+            </w:pPr>
+            <w:r>
+              <w:rPr>
+                <w:rFonts w:ascii="Calibri" w:hAnsi="Calibri"/>
+                <w:color w:val="334155"/>
+                <w:sz w:val="17"/>
+              </w:rPr>
+              <w:t>[score, critical-fail status, key cohort evidence]</w:t>
+            </w:r>
+          </w:p>
+        </w:tc>
+        <w:tc>
+          <w:tcPr>
+            <w:tcW w:type="dxa" w:w="2526"/>
+            <w:shd w:fill="FFFFFF"/>
+            <w:tcMar>
+              <w:top w:w="80" w:type="dxa"/>
+              <w:bottom w:w="80" w:type="dxa"/>
+              <w:left w:w="90" w:type="dxa"/>
+              <w:right w:w="90" w:type="dxa"/>
+            </w:tcMar>
+          </w:tcPr>
+          <w:p>
+            <w:pPr>
+              <w:spacing w:after="0"/>
+            </w:pPr>
+            <w:r>
+              <w:rPr>
+                <w:rFonts w:ascii="Calibri" w:hAnsi="Calibri"/>
+                <w:color w:val="334155"/>
+                <w:sz w:val="17"/>
+              </w:rPr>
+              <w:t>[YYYY-MM-DD]</w:t>
             </w:r>
           </w:p>
         </w:tc>

</xml_diff>